<commit_message>
deleted rev1 doc and added notes to NewPaper
</commit_message>
<xml_diff>
--- a/NewPaper.docx
+++ b/NewPaper.docx
@@ -92,7 +92,7 @@
             </mc:Choice>
             <mc:Fallback>
               <w:pict>
-                <v:shape w14:anchorId="0F718E70" id="Graphic 1" o:spid="_x0000_s1026" style="position:absolute;margin-left:0;margin-top:701.55pt;width:595.3pt;height:1.45pt;z-index:15729152;visibility:visible;mso-wrap-style:square;mso-wrap-distance-left:0;mso-wrap-distance-top:0;mso-wrap-distance-right:0;mso-wrap-distance-bottom:0;mso-position-horizontal:absolute;mso-position-horizontal-relative:page;mso-position-vertical:absolute;mso-position-vertical-relative:page;v-text-anchor:top" coordsize="7560309,18415" o:gfxdata="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" path="m7559992,l,,,17995r7559992,l7559992,xe" fillcolor="#0084c1" stroked="f">
+                <v:shape w14:anchorId="411CCBD2" id="Graphic 1" o:spid="_x0000_s1026" style="position:absolute;margin-left:0;margin-top:701.55pt;width:595.3pt;height:1.45pt;z-index:15729152;visibility:visible;mso-wrap-style:square;mso-wrap-distance-left:0;mso-wrap-distance-top:0;mso-wrap-distance-right:0;mso-wrap-distance-bottom:0;mso-position-horizontal:absolute;mso-position-horizontal-relative:page;mso-position-vertical:absolute;mso-position-vertical-relative:page;v-text-anchor:top" coordsize="7560309,18415" o:gfxdata="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" path="m7559992,l,,,17995r7559992,l7559992,xe" fillcolor="#0084c1" stroked="f">
                   <v:path arrowok="t"/>
                   <w10:wrap anchorx="page" anchory="page"/>
                 </v:shape>
@@ -178,7 +178,7 @@
             </mc:Choice>
             <mc:Fallback>
               <w:pict>
-                <v:shape w14:anchorId="30823C52" id="Graphic 2" o:spid="_x0000_s1026" style="position:absolute;margin-left:0;margin-top:138.9pt;width:595.3pt;height:1.45pt;z-index:15729664;visibility:visible;mso-wrap-style:square;mso-wrap-distance-left:0;mso-wrap-distance-top:0;mso-wrap-distance-right:0;mso-wrap-distance-bottom:0;mso-position-horizontal:absolute;mso-position-horizontal-relative:page;mso-position-vertical:absolute;mso-position-vertical-relative:page;v-text-anchor:top" coordsize="7560309,18415" o:gfxdata="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" path="m7559992,l,,,17995r7559992,l7559992,xe" fillcolor="#0084c1" stroked="f">
+                <v:shape w14:anchorId="0395B7CD" id="Graphic 2" o:spid="_x0000_s1026" style="position:absolute;margin-left:0;margin-top:138.9pt;width:595.3pt;height:1.45pt;z-index:15729664;visibility:visible;mso-wrap-style:square;mso-wrap-distance-left:0;mso-wrap-distance-top:0;mso-wrap-distance-right:0;mso-wrap-distance-bottom:0;mso-position-horizontal:absolute;mso-position-horizontal-relative:page;mso-position-vertical:absolute;mso-position-vertical-relative:page;v-text-anchor:top" coordsize="7560309,18415" o:gfxdata="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" path="m7559992,l,,,17995r7559992,l7559992,xe" fillcolor="#0084c1" stroked="f">
                   <v:path arrowok="t"/>
                   <w10:wrap anchorx="page" anchory="page"/>
                 </v:shape>
@@ -341,7 +341,7 @@
             </mc:Choice>
             <mc:Fallback>
               <w:pict>
-                <v:group w14:anchorId="654E1326" id="Group 4" o:spid="_x0000_s1026" style="position:absolute;margin-left:96.85pt;margin-top:15.85pt;width:59.8pt;height:16.15pt;z-index:15731200;mso-wrap-distance-left:0;mso-wrap-distance-right:0;mso-position-horizontal-relative:page" coordsize="7594,2051" o:gfxdata="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">
+                <v:group w14:anchorId="1C0384DF" id="Group 4" o:spid="_x0000_s1026" style="position:absolute;margin-left:96.85pt;margin-top:15.85pt;width:59.8pt;height:16.15pt;z-index:15731200;mso-wrap-distance-left:0;mso-wrap-distance-right:0;mso-position-horizontal-relative:page" coordsize="7594,2051" o:gfxdata="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">
                   <v:shapetype id="_x0000_t75" coordsize="21600,21600" o:spt="75" o:preferrelative="t" path="m@4@5l@4@11@9@11@9@5xe" filled="f" stroked="f">
                     <v:stroke joinstyle="miter"/>
                     <v:formulas>
@@ -496,7 +496,7 @@
             </mc:Choice>
             <mc:Fallback>
               <w:pict>
-                <v:group w14:anchorId="09AADABF" id="Group 8" o:spid="_x0000_s1026" style="position:absolute;margin-left:160.25pt;margin-top:16.05pt;width:21.75pt;height:15.75pt;z-index:15731712;mso-wrap-distance-left:0;mso-wrap-distance-right:0;mso-position-horizontal-relative:page" coordsize="276225,200025" o:gfxdata="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">
+                <v:group w14:anchorId="108FE022" id="Group 8" o:spid="_x0000_s1026" style="position:absolute;margin-left:160.25pt;margin-top:16.05pt;width:21.75pt;height:15.75pt;z-index:15731712;mso-wrap-distance-left:0;mso-wrap-distance-right:0;mso-position-horizontal-relative:page" coordsize="276225,200025" o:gfxdata="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">
                   <v:shape id="Graphic 9" o:spid="_x0000_s1027" style="position:absolute;left:-3;top:16;width:113030;height:199390;visibility:visible;mso-wrap-style:square;v-text-anchor:top" coordsize="113030,199390" o:gfxdata="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" path="m112661,186690r-97015,l15646,,,,,186690r,12700l112661,199390r,-12700xe" fillcolor="#020303" stroked="f">
                     <v:path arrowok="t"/>
                   </v:shape>
@@ -1606,7 +1606,7 @@
           </mc:Choice>
           <mc:Fallback>
             <w:pict>
-              <v:shape w14:anchorId="32A6F68A" id="Graphic 12" o:spid="_x0000_s1026" style="position:absolute;margin-left:175.05pt;margin-top:15.9pt;width:245.2pt;height:1.4pt;z-index:-15728640;visibility:visible;mso-wrap-style:square;mso-wrap-distance-left:0;mso-wrap-distance-top:0;mso-wrap-distance-right:0;mso-wrap-distance-bottom:0;mso-position-horizontal:absolute;mso-position-horizontal-relative:page;mso-position-vertical:absolute;mso-position-vertical-relative:text;v-text-anchor:top" coordsize="3114040,17780" o:gfxdata="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" path="m3114001,l,,,17741r3114001,l3114001,xe" fillcolor="#0084c1" stroked="f">
+              <v:shape w14:anchorId="60983140" id="Graphic 12" o:spid="_x0000_s1026" style="position:absolute;margin-left:175.05pt;margin-top:15.9pt;width:245.2pt;height:1.4pt;z-index:-15728640;visibility:visible;mso-wrap-style:square;mso-wrap-distance-left:0;mso-wrap-distance-top:0;mso-wrap-distance-right:0;mso-wrap-distance-bottom:0;mso-position-horizontal:absolute;mso-position-horizontal-relative:page;mso-position-vertical:absolute;mso-position-vertical-relative:text;v-text-anchor:top" coordsize="3114040,17780" o:gfxdata="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" path="m3114001,l,,,17741r3114001,l3114001,xe" fillcolor="#0084c1" stroked="f">
                 <v:path arrowok="t"/>
                 <w10:wrap type="topAndBottom" anchorx="page"/>
               </v:shape>
@@ -2316,7 +2316,7 @@
             </mc:Choice>
             <mc:Fallback>
               <w:pict>
-                <v:group w14:anchorId="6C3DA492" id="Group 13" o:spid="_x0000_s1026" style="position:absolute;margin-left:45.35pt;margin-top:-1.85pt;width:42.75pt;height:42.75pt;z-index:15730176;mso-wrap-distance-left:0;mso-wrap-distance-right:0;mso-position-horizontal-relative:page" coordsize="5429,5429" o:gfxdata="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">
+                <v:group w14:anchorId="0D524AF2" id="Group 13" o:spid="_x0000_s1026" style="position:absolute;margin-left:45.35pt;margin-top:-1.85pt;width:42.75pt;height:42.75pt;z-index:15730176;mso-wrap-distance-left:0;mso-wrap-distance-right:0;mso-position-horizontal-relative:page" coordsize="5429,5429" o:gfxdata="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">
                   <v:shape id="Graphic 14" o:spid="_x0000_s1027" style="position:absolute;left:127;top:127;width:5175;height:5175;visibility:visible;mso-wrap-style:square;v-text-anchor:top" coordsize="517525,517525" o:gfxdata="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" path="m517474,258737r-4169,46506l501285,349015r-19138,40307l456619,425434r-31185,31185l389322,482147r-40307,19138l305243,513305r-46506,4169l212227,513305,168453,501285,128145,482147,92034,456619,60850,425434,35324,389322,16186,349015,4168,305243,,258737,4168,212231,16186,168458,35324,128151,60850,92039,92034,60854,128145,35327,168453,16188,212227,4168,258737,r46506,4168l349015,16188r40307,19139l425434,60854r31185,31185l482147,128151r19138,40307l513305,212231r4169,46506xe" filled="f" strokecolor="#0084c1" strokeweight="2pt">
                     <v:path arrowok="t"/>
                   </v:shape>
@@ -2766,14 +2766,12 @@
       <w:r>
         <w:t>(</w:t>
       </w:r>
-      <w:proofErr w:type="spellStart"/>
       <w:r>
         <w:rPr>
           <w:i/>
         </w:rPr>
         <w:t>Euphausia</w:t>
       </w:r>
-      <w:proofErr w:type="spellEnd"/>
       <w:r>
         <w:rPr>
           <w:i/>
@@ -4677,23 +4675,7 @@
         <w:t xml:space="preserve"> </w:t>
       </w:r>
       <w:r>
-        <w:t xml:space="preserve">the Bransfield Strait), and of penguin foraging areas near King George Island. Additionally, as part of other oceanographic investigations, a repeat survey was conducted near the mouth of </w:t>
-      </w:r>
-      <w:proofErr w:type="spellStart"/>
-      <w:r>
-        <w:t>Gerlache</w:t>
-      </w:r>
-      <w:proofErr w:type="spellEnd"/>
-      <w:r>
-        <w:t xml:space="preserve"> Strait in SW Bransfield Strait. After completing the survey, the gliders were retrieved on January 27, 2024 south of </w:t>
-      </w:r>
-      <w:proofErr w:type="spellStart"/>
-      <w:r>
-        <w:t>Hoeseason</w:t>
-      </w:r>
-      <w:proofErr w:type="spellEnd"/>
-      <w:r>
-        <w:t xml:space="preserve"> Island by the RVIB</w:t>
+        <w:t>the Bransfield Strait), and of penguin foraging areas near King George Island. Additionally, as part of other oceanographic investigations, a repeat survey was conducted near the mouth of Gerlache Strait in SW Bransfield Strait. After completing the survey, the gliders were retrieved on January 27, 2024 south of Hoeseason Island by the RVIB</w:t>
       </w:r>
       <w:r>
         <w:rPr>
@@ -4721,39 +4703,7 @@
         <w:ind w:left="100" w:right="118"/>
       </w:pPr>
       <w:r>
-        <w:t xml:space="preserve">The two gliders were equipped with a Sea-Bird Glider Payload CTD, an </w:t>
-      </w:r>
-      <w:proofErr w:type="spellStart"/>
-      <w:r>
-        <w:t>Aanderaa</w:t>
-      </w:r>
-      <w:proofErr w:type="spellEnd"/>
-      <w:r>
-        <w:t xml:space="preserve"> oxygen </w:t>
-      </w:r>
-      <w:proofErr w:type="spellStart"/>
-      <w:r>
-        <w:t>optode</w:t>
-      </w:r>
-      <w:proofErr w:type="spellEnd"/>
-      <w:r>
-        <w:t xml:space="preserve"> model 4831, a </w:t>
-      </w:r>
-      <w:proofErr w:type="spellStart"/>
-      <w:r>
-        <w:t>Wetlabs</w:t>
-      </w:r>
-      <w:proofErr w:type="spellEnd"/>
-      <w:r>
-        <w:t xml:space="preserve"> </w:t>
-      </w:r>
-      <w:proofErr w:type="spellStart"/>
-      <w:r>
-        <w:t>Ecopuck</w:t>
-      </w:r>
-      <w:proofErr w:type="spellEnd"/>
-      <w:r>
-        <w:t xml:space="preserve"> (FLBBC) that measure fluorescence, colored dissolved organic matter,</w:t>
+        <w:t>The two gliders were equipped with a Sea-Bird Glider Payload CTD, an Aanderaa oxygen optode model 4831, a Wetlabs Ecopuck (FLBBC) that measure fluorescence, colored dissolved organic matter,</w:t>
       </w:r>
       <w:r>
         <w:rPr>
@@ -4915,15 +4865,7 @@
         <w:t xml:space="preserve"> </w:t>
       </w:r>
       <w:r>
-        <w:t xml:space="preserve">a </w:t>
-      </w:r>
-      <w:proofErr w:type="spellStart"/>
-      <w:r>
-        <w:t>wetbay</w:t>
-      </w:r>
-      <w:proofErr w:type="spellEnd"/>
-      <w:r>
-        <w:t xml:space="preserve"> forward of</w:t>
+        <w:t>a wetbay forward of</w:t>
       </w:r>
       <w:r>
         <w:rPr>
@@ -5406,11 +5348,9 @@
         </w:rPr>
         <w:t xml:space="preserve"> </w:t>
       </w:r>
-      <w:proofErr w:type="spellStart"/>
       <w:r>
         <w:t>Demer</w:t>
       </w:r>
-      <w:proofErr w:type="spellEnd"/>
       <w:r>
         <w:rPr>
           <w:spacing w:val="-3"/>
@@ -5446,23 +5386,7 @@
       </w:r>
       <w:ins w:id="87" w:author="Anthony Cossio" w:date="2025-05-09T15:00:00Z">
         <w:r>
-          <w:t xml:space="preserve">In March, a 25.4 mm tungsten carbide sphere was attached to the </w:t>
-        </w:r>
-        <w:proofErr w:type="spellStart"/>
-        <w:r>
-          <w:t>wetbay</w:t>
-        </w:r>
-        <w:proofErr w:type="spellEnd"/>
-        <w:r>
-          <w:t xml:space="preserve"> of the glider, hanging </w:t>
-        </w:r>
-        <w:proofErr w:type="spellStart"/>
-        <w:r>
-          <w:t>donw</w:t>
-        </w:r>
-        <w:proofErr w:type="spellEnd"/>
-        <w:r>
-          <w:t xml:space="preserve"> from monofilament line on either side of the tr</w:t>
+          <w:t>In March, a 25.4 mm tungsten carbide sphere was attached to the wetbay of the glider, hanging donw from monofilament line on either side of the tr</w:t>
         </w:r>
       </w:ins>
       <w:ins w:id="88" w:author="Anthony Cossio" w:date="2025-05-09T15:01:00Z">
@@ -5803,11 +5727,9 @@
         </w:rPr>
         <w:t xml:space="preserve"> </w:t>
       </w:r>
-      <w:proofErr w:type="spellStart"/>
       <w:r>
         <w:t>Echoview</w:t>
       </w:r>
-      <w:proofErr w:type="spellEnd"/>
       <w:r>
         <w:rPr>
           <w:spacing w:val="-3"/>
@@ -5852,15 +5774,7 @@
         <w:ind w:left="100" w:right="124"/>
       </w:pPr>
       <w:r>
-        <w:t xml:space="preserve">The acoustic data were analyzed using </w:t>
-      </w:r>
-      <w:proofErr w:type="spellStart"/>
-      <w:r>
-        <w:t>Echoview</w:t>
-      </w:r>
-      <w:proofErr w:type="spellEnd"/>
-      <w:r>
-        <w:t xml:space="preserve"> software (</w:t>
+        <w:t>The acoustic data were analyzed using Echoview software (</w:t>
       </w:r>
       <w:del w:id="102" w:author="Anthony Cossio" w:date="2025-04-01T16:11:00Z">
         <w:r>
@@ -5963,15 +5877,7 @@
         <w:t xml:space="preserve"> </w:t>
       </w:r>
       <w:r>
-        <w:t>the glider samples. Basic processing of the data included removing the first ten meters of a dive to account for any bubbles adhering to the transducer face, removing the first three meters from the transducer face to account for ringdown, and identifying the bottom echo and stepping back three meters from the bottom echo. Background noise removal was applied, followed by impulse noise removal, when necessary, to clean the data (</w:t>
-      </w:r>
-      <w:proofErr w:type="spellStart"/>
-      <w:r>
-        <w:t>DeRobertis</w:t>
-      </w:r>
-      <w:proofErr w:type="spellEnd"/>
-      <w:r>
-        <w:t xml:space="preserve"> and Higginbottom 2007). This process was done for both the 70 and 120 kHz data. Decibel differencing was not used to delineate krill like in previous studies (Reiss et al. 2021), instead we integrated all the echo energy, without krill delineation. This provides a ceiling for the biomass density estimates because the energy can also include other scatterers that are not krill. </w:t>
+        <w:t xml:space="preserve">the glider samples. Basic processing of the data included removing the first ten meters of a dive to account for any bubbles adhering to the transducer face, removing the first three meters from the transducer face to account for ringdown, and identifying the bottom echo and stepping back three meters from the bottom echo. Background noise removal was applied, followed by impulse noise removal, when necessary, to clean the data (DeRobertis and Higginbottom 2007). This process was done for both the 70 and 120 kHz data. Decibel differencing was not used to delineate krill like in previous studies (Reiss et al. 2021), instead we integrated all the echo energy, without krill delineation. This provides a ceiling for the biomass density estimates because the energy can also include other scatterers that are not krill. </w:t>
       </w:r>
       <w:moveToRangeStart w:id="104" w:author="Anthony Cossio" w:date="2025-04-01T16:23:00Z" w:name="move194417026"/>
       <w:moveTo w:id="105" w:author="Anthony Cossio" w:date="2025-04-01T16:23:00Z">
@@ -6121,15 +6027,7 @@
         </w:r>
       </w:ins>
       <w:r>
-        <w:t xml:space="preserve">The second method, we used the Shoal Analysis and Patch Estimation System (SHAPES, </w:t>
-      </w:r>
-      <w:proofErr w:type="spellStart"/>
-      <w:r>
-        <w:t>Cotezee</w:t>
-      </w:r>
-      <w:proofErr w:type="spellEnd"/>
-      <w:r>
-        <w:t xml:space="preserve">, 2000) or ‘schools’ detection algorithm for krill </w:t>
+        <w:t xml:space="preserve">The second method, we used the Shoal Analysis and Patch Estimation System (SHAPES, Cotezee, 2000) or ‘schools’ detection algorithm for krill </w:t>
       </w:r>
       <w:del w:id="107" w:author="Anthony Cossio" w:date="2025-04-02T08:23:00Z">
         <w:r>
@@ -6204,11 +6102,9 @@
         </w:rPr>
         <w:t xml:space="preserve"> </w:t>
       </w:r>
-      <w:proofErr w:type="spellStart"/>
       <w:r>
         <w:t>Guihen</w:t>
       </w:r>
-      <w:proofErr w:type="spellEnd"/>
       <w:r>
         <w:rPr>
           <w:spacing w:val="-3"/>
@@ -6571,13 +6467,8 @@
         </w:rPr>
         <w:t xml:space="preserve"> </w:t>
       </w:r>
-      <w:proofErr w:type="spellStart"/>
-      <w:r>
-        <w:t>Echoview</w:t>
-      </w:r>
-      <w:proofErr w:type="spellEnd"/>
-      <w:r>
-        <w:t>,</w:t>
+      <w:r>
+        <w:t>Echoview,</w:t>
       </w:r>
       <w:r>
         <w:rPr>
@@ -6621,11 +6512,9 @@
         </w:rPr>
         <w:t xml:space="preserve"> </w:t>
       </w:r>
-      <w:proofErr w:type="spellStart"/>
       <w:r>
         <w:t>Matlab</w:t>
       </w:r>
-      <w:proofErr w:type="spellEnd"/>
       <w:r>
         <w:rPr>
           <w:spacing w:val="-3"/>
@@ -7531,21 +7420,7 @@
         <w:rPr>
           <w:color w:val="212121"/>
         </w:rPr>
-        <w:t xml:space="preserve">Because there were no concomitant net surveys in the region from which to generate a length frequency distribution, we used krill obtained from diets of penguins (Reid and Brierley 2001; Miller and </w:t>
-      </w:r>
-      <w:proofErr w:type="spellStart"/>
-      <w:r>
-        <w:rPr>
-          <w:color w:val="212121"/>
-        </w:rPr>
-        <w:t>Trivelpiece</w:t>
-      </w:r>
-      <w:proofErr w:type="spellEnd"/>
-      <w:r>
-        <w:rPr>
-          <w:color w:val="212121"/>
-        </w:rPr>
-        <w:t xml:space="preserve"> 2007). Length frequency data of Antarctic krill were collected from breeding gentoo penguins at Llano Point, King George Island, Antarctica, during January 2024. Penguins often spill small boluses of krill on the ground while feeding chicks. These fresh boluses were collected opportunistically from throughout the colony and immediately sorted to identify intact, whole individuals.</w:t>
+        <w:t>Because there were no concomitant net surveys in the region from which to generate a length frequency distribution, we used krill obtained from diets of penguins (Reid and Brierley 2001; Miller and Trivelpiece 2007). Length frequency data of Antarctic krill were collected from breeding gentoo penguins at Llano Point, King George Island, Antarctica, during January 2024. Penguins often spill small boluses of krill on the ground while feeding chicks. These fresh boluses were collected opportunistically from throughout the colony and immediately sorted to identify intact, whole individuals.</w:t>
       </w:r>
       <w:r>
         <w:rPr>
@@ -8839,14 +8714,7 @@
         <w:rPr>
           <w:color w:val="212121"/>
         </w:rPr>
-        <w:t xml:space="preserve">Using the schools method, similar differences in biomass density were observed (Table 4), and </w:t>
-      </w:r>
-      <w:proofErr w:type="spellStart"/>
-      <w:r>
-        <w:rPr>
-          <w:color w:val="212121"/>
-        </w:rPr>
-        <w:t>interestingly,</w:t>
+        <w:t>Using the schools method, similar differences in biomass density were observed (Table 4), and interestingly,</w:t>
       </w:r>
       <w:del w:id="139" w:author="Anthony Cossio" w:date="2025-05-09T15:26:00Z">
         <w:r>
@@ -8860,14 +8728,7 @@
         <w:rPr>
           <w:color w:val="212121"/>
         </w:rPr>
-        <w:t>large</w:t>
-      </w:r>
-      <w:proofErr w:type="spellEnd"/>
-      <w:r>
-        <w:rPr>
-          <w:color w:val="212121"/>
-        </w:rPr>
-        <w:t xml:space="preserve"> differences in the number of schools were detected. </w:t>
+        <w:t xml:space="preserve">large differences in the number of schools were detected. </w:t>
       </w:r>
       <w:ins w:id="140" w:author="Anthony Cossio" w:date="2025-05-09T15:27:00Z">
         <w:r>
@@ -9353,14 +9214,12 @@
         </w:rPr>
         <w:t xml:space="preserve"> </w:t>
       </w:r>
-      <w:proofErr w:type="spellStart"/>
       <w:r>
         <w:rPr>
           <w:color w:val="212121"/>
         </w:rPr>
         <w:t>Sv</w:t>
       </w:r>
-      <w:proofErr w:type="spellEnd"/>
       <w:r>
         <w:rPr>
           <w:color w:val="212121"/>
@@ -10882,15 +10741,7 @@
         <w:commentReference w:id="171"/>
       </w:r>
       <w:r>
-        <w:t xml:space="preserve"> </w:t>
-      </w:r>
-      <w:proofErr w:type="spellStart"/>
-      <w:r>
-        <w:t>nmi</w:t>
-      </w:r>
-      <w:proofErr w:type="spellEnd"/>
-      <w:r>
-        <w:t xml:space="preserve"> per grid cell. We than allocated the glider dives to these cells and averaged all data within a grid. This reduced the number of data points of each glider by more than half from 321 (AMLR03) and 323 (AMLR04) profiles</w:t>
+        <w:t xml:space="preserve"> nmi per grid cell. We than allocated the glider dives to these cells and averaged all data within a grid. This reduced the number of data points of each glider by more than half from 321 (AMLR03) and 323 (AMLR04) profiles</w:t>
       </w:r>
       <w:r>
         <w:rPr>
@@ -11841,15 +11692,7 @@
         <w:t xml:space="preserve"> </w:t>
       </w:r>
       <w:r>
-        <w:t>is robust, and provides similar estimates to ships (</w:t>
-      </w:r>
-      <w:proofErr w:type="spellStart"/>
-      <w:r>
-        <w:t>Kinzey</w:t>
-      </w:r>
-      <w:proofErr w:type="spellEnd"/>
-      <w:r>
-        <w:t xml:space="preserve"> et al. 2022). Here we have shown that the statistical distribution properties between two gliders flying the same survey pattern is also robust. Finally, we have</w:t>
+        <w:t>is robust, and provides similar estimates to ships (Kinzey et al. 2022). Here we have shown that the statistical distribution properties between two gliders flying the same survey pattern is also robust. Finally, we have</w:t>
       </w:r>
       <w:r>
         <w:rPr>
@@ -12623,15 +12466,7 @@
         <w:t xml:space="preserve"> </w:t>
       </w:r>
       <w:r>
-        <w:t xml:space="preserve">biomass can be grossly off. </w:t>
-      </w:r>
-      <w:proofErr w:type="spellStart"/>
-      <w:r>
-        <w:t>Tesler</w:t>
-      </w:r>
-      <w:proofErr w:type="spellEnd"/>
-      <w:r>
-        <w:t xml:space="preserve"> (1989) noted that calibration error can account for 12 -26 percent of systemic error thus making it an important factor in acoustic analysis.</w:t>
+        <w:t>biomass can be grossly off. Tesler (1989) noted that calibration error can account for 12 -26 percent of systemic error thus making it an important factor in acoustic analysis.</w:t>
       </w:r>
       <w:r>
         <w:rPr>
@@ -12767,15 +12602,7 @@
         <w:ind w:left="100" w:right="153"/>
       </w:pPr>
       <w:r>
-        <w:t xml:space="preserve">Krill school parameters were slightly different than those in </w:t>
-      </w:r>
-      <w:proofErr w:type="spellStart"/>
-      <w:r>
-        <w:t>Guihen</w:t>
-      </w:r>
-      <w:proofErr w:type="spellEnd"/>
-      <w:r>
-        <w:t xml:space="preserve"> et al. (2014). They tested a number of different parameters as well as comparing EK60 ship </w:t>
+        <w:t xml:space="preserve">Krill school parameters were slightly different than those in Guihen et al. (2014). They tested a number of different parameters as well as comparing EK60 ship </w:t>
       </w:r>
       <w:ins w:id="178" w:author="Anthony Cossio" w:date="2025-04-02T08:23:00Z">
         <w:r>
@@ -12788,15 +12615,7 @@
         </w:r>
       </w:del>
       <w:r>
-        <w:t xml:space="preserve"> parameters and a </w:t>
-      </w:r>
-      <w:proofErr w:type="spellStart"/>
-      <w:r>
-        <w:t>Seaglider</w:t>
-      </w:r>
-      <w:proofErr w:type="spellEnd"/>
-      <w:r>
-        <w:t xml:space="preserve"> equipped with an ES853 single beam echosounder. They noted that glider derived data were coherent with ship-borne measurements using school analysis. Krill schools are being identified deeper than 250m that are most likely not krill. We are still testing the optimal parameters for use with</w:t>
+        <w:t xml:space="preserve"> parameters and a Seaglider equipped with an ES853 single beam echosounder. They noted that glider derived data were coherent with ship-borne measurements using school analysis. Krill schools are being identified deeper than 250m that are most likely not krill. We are still testing the optimal parameters for use with</w:t>
       </w:r>
       <w:r>
         <w:rPr>
@@ -13157,23 +12976,7 @@
         <w:t xml:space="preserve"> </w:t>
       </w:r>
       <w:r>
-        <w:t>top 5 m of surface data since the likelihood of bubbles accumulating on the face of the transducer is minimal. Gliders could have much less bias in sampling krill due to diel vertical migration (</w:t>
-      </w:r>
-      <w:proofErr w:type="spellStart"/>
-      <w:r>
-        <w:t>Demer</w:t>
-      </w:r>
-      <w:proofErr w:type="spellEnd"/>
-      <w:r>
-        <w:t xml:space="preserve"> and Hewitt 1995) since gliders can begin sampling the water column at 3 meters. Ships using 120 kHz may not have a good signal to noise ratio past 500 m (De </w:t>
-      </w:r>
-      <w:proofErr w:type="spellStart"/>
-      <w:r>
-        <w:t>Robertis</w:t>
-      </w:r>
-      <w:proofErr w:type="spellEnd"/>
-      <w:r>
-        <w:t xml:space="preserve"> and Higginbottom 2007) while the glider can use the 120 kHz down to 1000 m making it a valuable tool to sample possible deep euphausiids. Ships are also inherently noisy while a glider is quiet, allow for cleaner acoustic data collection since it is buoyancy driven.</w:t>
+        <w:t>top 5 m of surface data since the likelihood of bubbles accumulating on the face of the transducer is minimal. Gliders could have much less bias in sampling krill due to diel vertical migration (Demer and Hewitt 1995) since gliders can begin sampling the water column at 3 meters. Ships using 120 kHz may not have a good signal to noise ratio past 500 m (De Robertis and Higginbottom 2007) while the glider can use the 120 kHz down to 1000 m making it a valuable tool to sample possible deep euphausiids. Ships are also inherently noisy while a glider is quiet, allow for cleaner acoustic data collection since it is buoyancy driven.</w:t>
       </w:r>
     </w:p>
     <w:p>
@@ -14171,19 +13974,11 @@
         </w:rPr>
         <w:t xml:space="preserve"> </w:t>
       </w:r>
-      <w:proofErr w:type="spellStart"/>
-      <w:r>
-        <w:rPr>
-          <w:color w:val="212121"/>
-        </w:rPr>
-        <w:t>characterise</w:t>
-      </w:r>
-      <w:proofErr w:type="spellEnd"/>
-      <w:r>
-        <w:rPr>
-          <w:color w:val="212121"/>
-        </w:rPr>
-        <w:t xml:space="preserve"> sardine schools. </w:t>
+      <w:r>
+        <w:rPr>
+          <w:color w:val="212121"/>
+        </w:rPr>
+        <w:t xml:space="preserve">characterise sardine schools. </w:t>
       </w:r>
       <w:r>
         <w:rPr>
@@ -14222,21 +14017,7 @@
         <w:rPr>
           <w:color w:val="212121"/>
         </w:rPr>
-        <w:t xml:space="preserve">Cutter Jr, GR, Reiss, CS, </w:t>
-      </w:r>
-      <w:proofErr w:type="spellStart"/>
-      <w:r>
-        <w:rPr>
-          <w:color w:val="212121"/>
-        </w:rPr>
-        <w:t>Nylund</w:t>
-      </w:r>
-      <w:proofErr w:type="spellEnd"/>
-      <w:r>
-        <w:rPr>
-          <w:color w:val="212121"/>
-        </w:rPr>
-        <w:t>, S, and Watters, GM (2022). Antarctic krill biomass and flux measured</w:t>
+        <w:t>Cutter Jr, GR, Reiss, CS, Nylund, S, and Watters, GM (2022). Antarctic krill biomass and flux measured</w:t>
       </w:r>
       <w:r>
         <w:rPr>
@@ -14414,19 +14195,11 @@
         </w:rPr>
         <w:t xml:space="preserve"> </w:t>
       </w:r>
-      <w:proofErr w:type="spellStart"/>
-      <w:r>
-        <w:rPr>
-          <w:color w:val="212121"/>
-        </w:rPr>
-        <w:t>Robertis</w:t>
-      </w:r>
-      <w:proofErr w:type="spellEnd"/>
-      <w:r>
-        <w:rPr>
-          <w:color w:val="212121"/>
-        </w:rPr>
-        <w:t>,</w:t>
+      <w:r>
+        <w:rPr>
+          <w:color w:val="212121"/>
+        </w:rPr>
+        <w:t>Robertis,</w:t>
       </w:r>
       <w:r>
         <w:rPr>
@@ -14624,19 +14397,11 @@
         <w:spacing w:before="158" w:line="259" w:lineRule="auto"/>
         <w:ind w:left="100" w:right="210"/>
       </w:pPr>
-      <w:proofErr w:type="spellStart"/>
-      <w:r>
-        <w:rPr>
-          <w:color w:val="212121"/>
-        </w:rPr>
-        <w:t>Demer</w:t>
-      </w:r>
-      <w:proofErr w:type="spellEnd"/>
-      <w:r>
-        <w:rPr>
-          <w:color w:val="212121"/>
-        </w:rPr>
-        <w:t>,</w:t>
+      <w:r>
+        <w:rPr>
+          <w:color w:val="212121"/>
+        </w:rPr>
+        <w:t>Demer,</w:t>
       </w:r>
       <w:r>
         <w:rPr>
@@ -14684,19 +14449,11 @@
         </w:rPr>
         <w:t xml:space="preserve"> </w:t>
       </w:r>
-      <w:proofErr w:type="spellStart"/>
-      <w:r>
-        <w:rPr>
-          <w:color w:val="212121"/>
-        </w:rPr>
-        <w:t>Bernasconi</w:t>
-      </w:r>
-      <w:proofErr w:type="spellEnd"/>
-      <w:r>
-        <w:rPr>
-          <w:color w:val="212121"/>
-        </w:rPr>
-        <w:t>,</w:t>
+      <w:r>
+        <w:rPr>
+          <w:color w:val="212121"/>
+        </w:rPr>
+        <w:t>Bernasconi,</w:t>
       </w:r>
       <w:r>
         <w:rPr>
@@ -14718,19 +14475,11 @@
         </w:rPr>
         <w:t xml:space="preserve"> </w:t>
       </w:r>
-      <w:proofErr w:type="spellStart"/>
-      <w:r>
-        <w:rPr>
-          <w:color w:val="212121"/>
-        </w:rPr>
-        <w:t>Bethke</w:t>
-      </w:r>
-      <w:proofErr w:type="spellEnd"/>
-      <w:r>
-        <w:rPr>
-          <w:color w:val="212121"/>
-        </w:rPr>
-        <w:t>,</w:t>
+      <w:r>
+        <w:rPr>
+          <w:color w:val="212121"/>
+        </w:rPr>
+        <w:t>Bethke,</w:t>
       </w:r>
       <w:r>
         <w:rPr>
@@ -14791,14 +14540,12 @@
         </w:rPr>
         <w:t xml:space="preserve"> </w:t>
       </w:r>
-      <w:proofErr w:type="spellStart"/>
       <w:r>
         <w:rPr>
           <w:color w:val="212121"/>
         </w:rPr>
         <w:t>D,and</w:t>
       </w:r>
-      <w:proofErr w:type="spellEnd"/>
       <w:r>
         <w:rPr>
           <w:color w:val="212121"/>
@@ -14847,21 +14594,12 @@
           <w:sz w:val="24"/>
         </w:rPr>
       </w:pPr>
-      <w:proofErr w:type="spellStart"/>
       <w:r>
         <w:rPr>
           <w:color w:val="212121"/>
           <w:sz w:val="24"/>
         </w:rPr>
-        <w:t>Demer</w:t>
-      </w:r>
-      <w:proofErr w:type="spellEnd"/>
-      <w:r>
-        <w:rPr>
-          <w:color w:val="212121"/>
-          <w:sz w:val="24"/>
-        </w:rPr>
-        <w:t>,</w:t>
+        <w:t>Demer,</w:t>
       </w:r>
       <w:r>
         <w:rPr>
@@ -15066,7 +14804,6 @@
         </w:rPr>
         <w:t xml:space="preserve"> </w:t>
       </w:r>
-      <w:proofErr w:type="spellStart"/>
       <w:r>
         <w:rPr>
           <w:i/>
@@ -15075,7 +14812,6 @@
         </w:rPr>
         <w:t>Euphausia</w:t>
       </w:r>
-      <w:proofErr w:type="spellEnd"/>
       <w:r>
         <w:rPr>
           <w:i/>
@@ -15204,14 +14940,12 @@
         </w:rPr>
         <w:t xml:space="preserve"> </w:t>
       </w:r>
-      <w:proofErr w:type="spellStart"/>
       <w:r>
         <w:rPr>
           <w:color w:val="212121"/>
         </w:rPr>
         <w:t>Vestnes</w:t>
       </w:r>
-      <w:proofErr w:type="spellEnd"/>
       <w:r>
         <w:rPr>
           <w:color w:val="212121"/>
@@ -15352,19 +15086,11 @@
           <w:i/>
         </w:rPr>
       </w:pPr>
-      <w:proofErr w:type="spellStart"/>
-      <w:r>
-        <w:rPr>
-          <w:color w:val="212121"/>
-        </w:rPr>
-        <w:t>Guihen</w:t>
-      </w:r>
-      <w:proofErr w:type="spellEnd"/>
-      <w:r>
-        <w:rPr>
-          <w:color w:val="212121"/>
-        </w:rPr>
-        <w:t>,</w:t>
+      <w:r>
+        <w:rPr>
+          <w:color w:val="212121"/>
+        </w:rPr>
+        <w:t>Guihen,</w:t>
       </w:r>
       <w:r>
         <w:rPr>
@@ -15574,21 +15300,12 @@
         </w:rPr>
         <w:t>the use of ocean gliders to undertake acoustic measurements of zooplankton: the distribution and density of Antarctic krill (</w:t>
       </w:r>
-      <w:proofErr w:type="spellStart"/>
       <w:r>
         <w:rPr>
           <w:i/>
           <w:color w:val="212121"/>
         </w:rPr>
-        <w:t>Euphausia</w:t>
-      </w:r>
-      <w:proofErr w:type="spellEnd"/>
-      <w:r>
-        <w:rPr>
-          <w:i/>
-          <w:color w:val="212121"/>
-        </w:rPr>
-        <w:t xml:space="preserve"> superba</w:t>
+        <w:t>Euphausia superba</w:t>
       </w:r>
       <w:r>
         <w:rPr>
@@ -15677,23 +15394,7 @@
         <w:ind w:left="100" w:right="228"/>
       </w:pPr>
       <w:r>
-        <w:t xml:space="preserve">Hewitt, RP, </w:t>
-      </w:r>
-      <w:proofErr w:type="spellStart"/>
-      <w:r>
-        <w:t>Demer</w:t>
-      </w:r>
-      <w:proofErr w:type="spellEnd"/>
-      <w:r>
-        <w:t xml:space="preserve"> DA, and </w:t>
-      </w:r>
-      <w:proofErr w:type="spellStart"/>
-      <w:r>
-        <w:t>Emerey</w:t>
-      </w:r>
-      <w:proofErr w:type="spellEnd"/>
-      <w:r>
-        <w:t>, JH. (2003). An 8-year cycle in krill biomass density inferred from acoustics surveys conducted in the vicinity of South Shetland Islands during the austral summers</w:t>
+        <w:t>Hewitt, RP, Demer DA, and Emerey, JH. (2003). An 8-year cycle in krill biomass density inferred from acoustics surveys conducted in the vicinity of South Shetland Islands during the austral summers</w:t>
       </w:r>
       <w:r>
         <w:rPr>
@@ -15825,11 +15526,9 @@
         <w:spacing w:before="159" w:line="259" w:lineRule="auto"/>
         <w:ind w:left="100"/>
       </w:pPr>
-      <w:proofErr w:type="spellStart"/>
       <w:r>
         <w:t>Kinzey</w:t>
       </w:r>
-      <w:proofErr w:type="spellEnd"/>
       <w:r>
         <w:rPr>
           <w:spacing w:val="-1"/>
@@ -15989,13 +15688,8 @@
         </w:rPr>
         <w:t xml:space="preserve"> </w:t>
       </w:r>
-      <w:proofErr w:type="spellStart"/>
-      <w:r>
-        <w:t>doi</w:t>
-      </w:r>
-      <w:proofErr w:type="spellEnd"/>
-      <w:r>
-        <w:t xml:space="preserve">: </w:t>
+      <w:r>
+        <w:t xml:space="preserve">doi: </w:t>
       </w:r>
       <w:r>
         <w:rPr>
@@ -16059,19 +15753,11 @@
         </w:rPr>
         <w:t xml:space="preserve"> </w:t>
       </w:r>
-      <w:proofErr w:type="spellStart"/>
-      <w:r>
-        <w:rPr>
-          <w:color w:val="212121"/>
-        </w:rPr>
-        <w:t>Trivelpiece</w:t>
-      </w:r>
-      <w:proofErr w:type="spellEnd"/>
-      <w:r>
-        <w:rPr>
-          <w:color w:val="212121"/>
-        </w:rPr>
-        <w:t>,</w:t>
+      <w:r>
+        <w:rPr>
+          <w:color w:val="212121"/>
+        </w:rPr>
+        <w:t>Trivelpiece,</w:t>
       </w:r>
       <w:r>
         <w:rPr>
@@ -16132,7 +15818,6 @@
         </w:rPr>
         <w:t xml:space="preserve"> </w:t>
       </w:r>
-      <w:proofErr w:type="spellStart"/>
       <w:r>
         <w:rPr>
           <w:i/>
@@ -16140,7 +15825,6 @@
         </w:rPr>
         <w:t>Euphausia</w:t>
       </w:r>
-      <w:proofErr w:type="spellEnd"/>
       <w:r>
         <w:rPr>
           <w:i/>
@@ -16212,21 +15896,7 @@
         <w:rPr>
           <w:color w:val="212121"/>
         </w:rPr>
-        <w:t xml:space="preserve">diet of </w:t>
-      </w:r>
-      <w:proofErr w:type="spellStart"/>
-      <w:r>
-        <w:rPr>
-          <w:color w:val="212121"/>
-        </w:rPr>
-        <w:t>Pygoscelid</w:t>
-      </w:r>
-      <w:proofErr w:type="spellEnd"/>
-      <w:r>
-        <w:rPr>
-          <w:color w:val="212121"/>
-        </w:rPr>
-        <w:t xml:space="preserve"> penguins and net trawls in the South Shetland Islands, Antarctica. Polar Biology, 30, </w:t>
+        <w:t xml:space="preserve">diet of Pygoscelid penguins and net trawls in the South Shetland Islands, Antarctica. Polar Biology, 30, </w:t>
       </w:r>
       <w:r>
         <w:rPr>
@@ -16528,19 +16198,11 @@
         </w:rPr>
         <w:t xml:space="preserve"> </w:t>
       </w:r>
-      <w:proofErr w:type="spellStart"/>
-      <w:r>
-        <w:rPr>
-          <w:color w:val="212121"/>
-        </w:rPr>
-        <w:t>Demer</w:t>
-      </w:r>
-      <w:proofErr w:type="spellEnd"/>
-      <w:r>
-        <w:rPr>
-          <w:color w:val="212121"/>
-        </w:rPr>
-        <w:t>,</w:t>
+      <w:r>
+        <w:rPr>
+          <w:color w:val="212121"/>
+        </w:rPr>
+        <w:t>Demer,</w:t>
       </w:r>
       <w:r>
         <w:rPr>
@@ -16659,21 +16321,12 @@
         </w:rPr>
         <w:t>krill (</w:t>
       </w:r>
-      <w:proofErr w:type="spellStart"/>
       <w:r>
         <w:rPr>
           <w:i/>
           <w:color w:val="212121"/>
         </w:rPr>
-        <w:t>Euphausia</w:t>
-      </w:r>
-      <w:proofErr w:type="spellEnd"/>
-      <w:r>
-        <w:rPr>
-          <w:i/>
-          <w:color w:val="212121"/>
-        </w:rPr>
-        <w:t xml:space="preserve"> superba</w:t>
+        <w:t>Euphausia superba</w:t>
       </w:r>
       <w:r>
         <w:rPr>
@@ -16815,15 +16468,7 @@
         <w:t xml:space="preserve"> </w:t>
       </w:r>
       <w:r>
-        <w:t xml:space="preserve">by Antarctic krill under varying sea-ice conditions: implications for top predators and fishery management. Mar </w:t>
-      </w:r>
-      <w:proofErr w:type="spellStart"/>
-      <w:r>
-        <w:t>Ecol</w:t>
-      </w:r>
-      <w:proofErr w:type="spellEnd"/>
-      <w:r>
-        <w:t xml:space="preserve"> Prog Ser 568:1-16. https://doi.org/10.3354/meps12099</w:t>
+        <w:t>by Antarctic krill under varying sea-ice conditions: implications for top predators and fishery management. Mar Ecol Prog Ser 568:1-16. https://doi.org/10.3354/meps12099</w:t>
       </w:r>
     </w:p>
     <w:p>
@@ -16925,14 +16570,12 @@
       <w:r>
         <w:t>(</w:t>
       </w:r>
-      <w:proofErr w:type="spellStart"/>
       <w:r>
         <w:rPr>
           <w:i/>
         </w:rPr>
         <w:t>Euphausia</w:t>
       </w:r>
-      <w:proofErr w:type="spellEnd"/>
       <w:r>
         <w:rPr>
           <w:i/>
@@ -16947,15 +16590,7 @@
         <w:t>superba</w:t>
       </w:r>
       <w:r>
-        <w:t xml:space="preserve">) Around the Northern Antarctic Peninsula. Front. Mar. Sci. 8:604043. </w:t>
-      </w:r>
-      <w:proofErr w:type="spellStart"/>
-      <w:r>
-        <w:t>doi</w:t>
-      </w:r>
-      <w:proofErr w:type="spellEnd"/>
-      <w:r>
-        <w:t xml:space="preserve">: </w:t>
+        <w:t xml:space="preserve">) Around the Northern Antarctic Peninsula. Front. Mar. Sci. 8:604043. doi: </w:t>
       </w:r>
       <w:r>
         <w:rPr>
@@ -17114,21 +16749,12 @@
           <w:sz w:val="24"/>
         </w:rPr>
       </w:pPr>
-      <w:proofErr w:type="spellStart"/>
       <w:r>
         <w:rPr>
           <w:color w:val="212121"/>
           <w:sz w:val="24"/>
         </w:rPr>
-        <w:t>Tesler</w:t>
-      </w:r>
-      <w:proofErr w:type="spellEnd"/>
-      <w:r>
-        <w:rPr>
-          <w:color w:val="212121"/>
-          <w:sz w:val="24"/>
-        </w:rPr>
-        <w:t>,</w:t>
+        <w:t>Tesler,</w:t>
       </w:r>
       <w:r>
         <w:rPr>
@@ -26914,40 +26540,49 @@
             <w:sz w:val="24"/>
             <w:szCs w:val="24"/>
           </w:rPr>
-          <w:t>. Table of bootstrapped densities with lower and upper confidence intervals and the number of binned data samples</w:t>
-        </w:r>
+          <w:t xml:space="preserve">. Table of bootstrapped densities with lower and upper confidence intervals and the </w:t>
+        </w:r>
+        <w:commentRangeStart w:id="591"/>
         <w:r>
           <w:rPr>
             <w:sz w:val="24"/>
             <w:szCs w:val="24"/>
           </w:rPr>
-          <w:t xml:space="preserve"> for the entire area </w:t>
+          <w:t>number</w:t>
         </w:r>
       </w:ins>
-      <w:ins w:id="591" w:author="Anthony Cossio" w:date="2025-04-02T09:35:00Z">
+      <w:commentRangeEnd w:id="591"/>
+      <w:ins w:id="592" w:author="Anthony Cossio" w:date="2025-05-15T13:21:00Z">
+        <w:r>
+          <w:rPr>
+            <w:rStyle w:val="CommentReference"/>
+          </w:rPr>
+          <w:commentReference w:id="591"/>
+        </w:r>
+      </w:ins>
+      <w:ins w:id="593" w:author="Anthony Cossio" w:date="2025-04-02T09:34:00Z">
         <w:r>
           <w:rPr>
             <w:sz w:val="24"/>
             <w:szCs w:val="24"/>
           </w:rPr>
-          <w:t xml:space="preserve">using </w:t>
-        </w:r>
-      </w:ins>
-      <w:ins w:id="592" w:author="Anthony Cossio" w:date="2025-04-02T09:34:00Z">
-        <w:r>
-          <w:rPr>
-            <w:rPrChange w:id="593" w:author="Anthony Cossio" w:date="2025-04-02T09:35:00Z">
-              <w:rPr>
-                <w:strike/>
-              </w:rPr>
-            </w:rPrChange>
-          </w:rPr>
-          <w:t>0.</w:t>
+          <w:t xml:space="preserve"> of binned data samples</w:t>
+        </w:r>
+        <w:r>
+          <w:rPr>
+            <w:sz w:val="24"/>
+            <w:szCs w:val="24"/>
+          </w:rPr>
+          <w:t xml:space="preserve"> for the entire area </w:t>
         </w:r>
       </w:ins>
       <w:ins w:id="594" w:author="Anthony Cossio" w:date="2025-04-02T09:35:00Z">
         <w:r>
-          <w:t>2</w:t>
+          <w:rPr>
+            <w:sz w:val="24"/>
+            <w:szCs w:val="24"/>
+          </w:rPr>
+          <w:t xml:space="preserve">using </w:t>
         </w:r>
       </w:ins>
       <w:ins w:id="595" w:author="Anthony Cossio" w:date="2025-04-02T09:34:00Z">
@@ -26959,12 +26594,29 @@
               </w:rPr>
             </w:rPrChange>
           </w:rPr>
+          <w:t>0.</w:t>
+        </w:r>
+      </w:ins>
+      <w:ins w:id="597" w:author="Anthony Cossio" w:date="2025-04-02T09:35:00Z">
+        <w:r>
+          <w:t>2</w:t>
+        </w:r>
+      </w:ins>
+      <w:ins w:id="598" w:author="Anthony Cossio" w:date="2025-04-02T09:34:00Z">
+        <w:r>
+          <w:rPr>
+            <w:rPrChange w:id="599" w:author="Anthony Cossio" w:date="2025-04-02T09:35:00Z">
+              <w:rPr>
+                <w:strike/>
+              </w:rPr>
+            </w:rPrChange>
+          </w:rPr>
           <w:t>°</w:t>
         </w:r>
         <w:r>
           <w:rPr>
             <w:spacing w:val="-2"/>
-            <w:rPrChange w:id="597" w:author="Anthony Cossio" w:date="2025-04-02T09:35:00Z">
+            <w:rPrChange w:id="600" w:author="Anthony Cossio" w:date="2025-04-02T09:35:00Z">
               <w:rPr>
                 <w:strike/>
                 <w:spacing w:val="-2"/>
@@ -26975,7 +26627,7 @@
         </w:r>
         <w:r>
           <w:rPr>
-            <w:rPrChange w:id="598" w:author="Anthony Cossio" w:date="2025-04-02T09:35:00Z">
+            <w:rPrChange w:id="601" w:author="Anthony Cossio" w:date="2025-04-02T09:35:00Z">
               <w:rPr>
                 <w:strike/>
               </w:rPr>
@@ -26986,7 +26638,7 @@
         <w:r>
           <w:rPr>
             <w:spacing w:val="-2"/>
-            <w:rPrChange w:id="599" w:author="Anthony Cossio" w:date="2025-04-02T09:35:00Z">
+            <w:rPrChange w:id="602" w:author="Anthony Cossio" w:date="2025-04-02T09:35:00Z">
               <w:rPr>
                 <w:strike/>
                 <w:spacing w:val="-2"/>
@@ -26997,7 +26649,7 @@
         </w:r>
         <w:r>
           <w:rPr>
-            <w:rPrChange w:id="600" w:author="Anthony Cossio" w:date="2025-04-02T09:35:00Z">
+            <w:rPrChange w:id="603" w:author="Anthony Cossio" w:date="2025-04-02T09:35:00Z">
               <w:rPr>
                 <w:strike/>
               </w:rPr>
@@ -27008,7 +26660,7 @@
         <w:r>
           <w:rPr>
             <w:spacing w:val="-4"/>
-            <w:rPrChange w:id="601" w:author="Anthony Cossio" w:date="2025-04-02T09:35:00Z">
+            <w:rPrChange w:id="604" w:author="Anthony Cossio" w:date="2025-04-02T09:35:00Z">
               <w:rPr>
                 <w:strike/>
                 <w:spacing w:val="-4"/>
@@ -27019,7 +26671,7 @@
         </w:r>
         <w:r>
           <w:rPr>
-            <w:rPrChange w:id="602" w:author="Anthony Cossio" w:date="2025-04-02T09:35:00Z">
+            <w:rPrChange w:id="605" w:author="Anthony Cossio" w:date="2025-04-02T09:35:00Z">
               <w:rPr>
                 <w:strike/>
               </w:rPr>
@@ -27030,7 +26682,7 @@
         <w:r>
           <w:rPr>
             <w:spacing w:val="-2"/>
-            <w:rPrChange w:id="603" w:author="Anthony Cossio" w:date="2025-04-02T09:35:00Z">
+            <w:rPrChange w:id="606" w:author="Anthony Cossio" w:date="2025-04-02T09:35:00Z">
               <w:rPr>
                 <w:strike/>
                 <w:spacing w:val="-2"/>
@@ -27041,7 +26693,7 @@
         </w:r>
         <w:r>
           <w:rPr>
-            <w:rPrChange w:id="604" w:author="Anthony Cossio" w:date="2025-04-02T09:35:00Z">
+            <w:rPrChange w:id="607" w:author="Anthony Cossio" w:date="2025-04-02T09:35:00Z">
               <w:rPr>
                 <w:strike/>
               </w:rPr>
@@ -27050,7 +26702,7 @@
           <w:t>cells</w:t>
         </w:r>
       </w:ins>
-      <w:ins w:id="605" w:author="Anthony Cossio" w:date="2025-04-02T09:35:00Z">
+      <w:ins w:id="608" w:author="Anthony Cossio" w:date="2025-04-02T09:35:00Z">
         <w:r>
           <w:t>.</w:t>
         </w:r>
@@ -27059,7 +26711,7 @@
     <w:p>
       <w:pPr>
         <w:rPr>
-          <w:ins w:id="606" w:author="Anthony Cossio" w:date="2025-04-02T09:34:00Z"/>
+          <w:ins w:id="609" w:author="Anthony Cossio" w:date="2025-04-02T09:34:00Z"/>
           <w:sz w:val="24"/>
           <w:szCs w:val="24"/>
         </w:rPr>
@@ -27086,7 +26738,7 @@
         <w:trPr>
           <w:trHeight w:val="288"/>
           <w:jc w:val="center"/>
-          <w:ins w:id="607" w:author="Anthony Cossio" w:date="2025-04-02T09:34:00Z"/>
+          <w:ins w:id="610" w:author="Anthony Cossio" w:date="2025-04-02T09:34:00Z"/>
         </w:trPr>
         <w:tc>
           <w:tcPr>
@@ -27097,12 +26749,12 @@
           <w:p>
             <w:pPr>
               <w:rPr>
-                <w:ins w:id="608" w:author="Anthony Cossio" w:date="2025-04-02T09:34:00Z"/>
+                <w:ins w:id="611" w:author="Anthony Cossio" w:date="2025-04-02T09:34:00Z"/>
                 <w:sz w:val="24"/>
                 <w:szCs w:val="24"/>
               </w:rPr>
             </w:pPr>
-            <w:ins w:id="609" w:author="Anthony Cossio" w:date="2025-04-02T09:34:00Z">
+            <w:ins w:id="612" w:author="Anthony Cossio" w:date="2025-04-02T09:34:00Z">
               <w:r>
                 <w:rPr>
                   <w:sz w:val="24"/>
@@ -27123,12 +26775,12 @@
             <w:pPr>
               <w:jc w:val="center"/>
               <w:rPr>
-                <w:ins w:id="610" w:author="Anthony Cossio" w:date="2025-04-02T09:34:00Z"/>
+                <w:ins w:id="613" w:author="Anthony Cossio" w:date="2025-04-02T09:34:00Z"/>
                 <w:sz w:val="24"/>
                 <w:szCs w:val="24"/>
               </w:rPr>
             </w:pPr>
-            <w:ins w:id="611" w:author="Anthony Cossio" w:date="2025-04-02T09:34:00Z">
+            <w:ins w:id="614" w:author="Anthony Cossio" w:date="2025-04-02T09:34:00Z">
               <w:r>
                 <w:rPr>
                   <w:sz w:val="24"/>
@@ -27147,12 +26799,12 @@
             <w:pPr>
               <w:jc w:val="center"/>
               <w:rPr>
-                <w:ins w:id="612" w:author="Anthony Cossio" w:date="2025-04-02T09:34:00Z"/>
+                <w:ins w:id="615" w:author="Anthony Cossio" w:date="2025-04-02T09:34:00Z"/>
                 <w:sz w:val="24"/>
                 <w:szCs w:val="24"/>
               </w:rPr>
             </w:pPr>
-            <w:ins w:id="613" w:author="Anthony Cossio" w:date="2025-04-02T09:34:00Z">
+            <w:ins w:id="616" w:author="Anthony Cossio" w:date="2025-04-02T09:34:00Z">
               <w:r>
                 <w:rPr>
                   <w:sz w:val="24"/>
@@ -27173,12 +26825,12 @@
             <w:pPr>
               <w:jc w:val="center"/>
               <w:rPr>
-                <w:ins w:id="614" w:author="Anthony Cossio" w:date="2025-04-02T09:34:00Z"/>
+                <w:ins w:id="617" w:author="Anthony Cossio" w:date="2025-04-02T09:34:00Z"/>
                 <w:sz w:val="24"/>
                 <w:szCs w:val="24"/>
               </w:rPr>
             </w:pPr>
-            <w:ins w:id="615" w:author="Anthony Cossio" w:date="2025-04-02T09:34:00Z">
+            <w:ins w:id="618" w:author="Anthony Cossio" w:date="2025-04-02T09:34:00Z">
               <w:r>
                 <w:rPr>
                   <w:sz w:val="24"/>
@@ -27199,12 +26851,12 @@
             <w:pPr>
               <w:jc w:val="center"/>
               <w:rPr>
-                <w:ins w:id="616" w:author="Anthony Cossio" w:date="2025-04-02T09:34:00Z"/>
+                <w:ins w:id="619" w:author="Anthony Cossio" w:date="2025-04-02T09:34:00Z"/>
                 <w:sz w:val="24"/>
                 <w:szCs w:val="24"/>
               </w:rPr>
             </w:pPr>
-            <w:ins w:id="617" w:author="Anthony Cossio" w:date="2025-04-02T09:34:00Z">
+            <w:ins w:id="620" w:author="Anthony Cossio" w:date="2025-04-02T09:34:00Z">
               <w:r>
                 <w:rPr>
                   <w:sz w:val="24"/>
@@ -27223,12 +26875,12 @@
             <w:pPr>
               <w:jc w:val="center"/>
               <w:rPr>
-                <w:ins w:id="618" w:author="Anthony Cossio" w:date="2025-04-02T09:34:00Z"/>
+                <w:ins w:id="621" w:author="Anthony Cossio" w:date="2025-04-02T09:34:00Z"/>
                 <w:sz w:val="24"/>
                 <w:szCs w:val="24"/>
               </w:rPr>
             </w:pPr>
-            <w:ins w:id="619" w:author="Anthony Cossio" w:date="2025-04-02T09:34:00Z">
+            <w:ins w:id="622" w:author="Anthony Cossio" w:date="2025-04-02T09:34:00Z">
               <w:r>
                 <w:rPr>
                   <w:sz w:val="24"/>
@@ -27249,12 +26901,12 @@
             <w:pPr>
               <w:jc w:val="center"/>
               <w:rPr>
-                <w:ins w:id="620" w:author="Anthony Cossio" w:date="2025-04-02T09:34:00Z"/>
+                <w:ins w:id="623" w:author="Anthony Cossio" w:date="2025-04-02T09:34:00Z"/>
                 <w:sz w:val="24"/>
                 <w:szCs w:val="24"/>
               </w:rPr>
             </w:pPr>
-            <w:ins w:id="621" w:author="Anthony Cossio" w:date="2025-04-02T09:34:00Z">
+            <w:ins w:id="624" w:author="Anthony Cossio" w:date="2025-04-02T09:34:00Z">
               <w:r>
                 <w:rPr>
                   <w:sz w:val="24"/>
@@ -27273,12 +26925,12 @@
             <w:pPr>
               <w:jc w:val="center"/>
               <w:rPr>
-                <w:ins w:id="622" w:author="Anthony Cossio" w:date="2025-04-02T09:34:00Z"/>
+                <w:ins w:id="625" w:author="Anthony Cossio" w:date="2025-04-02T09:34:00Z"/>
                 <w:sz w:val="24"/>
                 <w:szCs w:val="24"/>
               </w:rPr>
             </w:pPr>
-            <w:ins w:id="623" w:author="Anthony Cossio" w:date="2025-04-02T09:34:00Z">
+            <w:ins w:id="626" w:author="Anthony Cossio" w:date="2025-04-02T09:34:00Z">
               <w:r>
                 <w:rPr>
                   <w:sz w:val="24"/>
@@ -27294,7 +26946,7 @@
         <w:trPr>
           <w:trHeight w:val="288"/>
           <w:jc w:val="center"/>
-          <w:ins w:id="624" w:author="Anthony Cossio" w:date="2025-04-02T09:34:00Z"/>
+          <w:ins w:id="627" w:author="Anthony Cossio" w:date="2025-04-02T09:34:00Z"/>
         </w:trPr>
         <w:tc>
           <w:tcPr>
@@ -27305,12 +26957,12 @@
           <w:p>
             <w:pPr>
               <w:rPr>
-                <w:ins w:id="625" w:author="Anthony Cossio" w:date="2025-04-02T09:34:00Z"/>
+                <w:ins w:id="628" w:author="Anthony Cossio" w:date="2025-04-02T09:34:00Z"/>
                 <w:sz w:val="24"/>
                 <w:szCs w:val="24"/>
               </w:rPr>
             </w:pPr>
-            <w:ins w:id="626" w:author="Anthony Cossio" w:date="2025-04-02T09:34:00Z">
+            <w:ins w:id="629" w:author="Anthony Cossio" w:date="2025-04-02T09:34:00Z">
               <w:r>
                 <w:rPr>
                   <w:sz w:val="24"/>
@@ -27330,12 +26982,12 @@
             <w:pPr>
               <w:jc w:val="center"/>
               <w:rPr>
-                <w:ins w:id="627" w:author="Anthony Cossio" w:date="2025-04-02T09:34:00Z"/>
+                <w:ins w:id="630" w:author="Anthony Cossio" w:date="2025-04-02T09:34:00Z"/>
                 <w:sz w:val="24"/>
                 <w:szCs w:val="24"/>
               </w:rPr>
             </w:pPr>
-            <w:ins w:id="628" w:author="Anthony Cossio" w:date="2025-04-02T09:34:00Z">
+            <w:ins w:id="631" w:author="Anthony Cossio" w:date="2025-04-02T09:34:00Z">
               <w:r>
                 <w:rPr>
                   <w:sz w:val="24"/>
@@ -27354,12 +27006,12 @@
             <w:pPr>
               <w:jc w:val="center"/>
               <w:rPr>
-                <w:ins w:id="629" w:author="Anthony Cossio" w:date="2025-04-02T09:34:00Z"/>
+                <w:ins w:id="632" w:author="Anthony Cossio" w:date="2025-04-02T09:34:00Z"/>
                 <w:sz w:val="24"/>
                 <w:szCs w:val="24"/>
               </w:rPr>
             </w:pPr>
-            <w:ins w:id="630" w:author="Anthony Cossio" w:date="2025-04-02T09:34:00Z">
+            <w:ins w:id="633" w:author="Anthony Cossio" w:date="2025-04-02T09:34:00Z">
               <w:r>
                 <w:rPr>
                   <w:sz w:val="24"/>
@@ -27379,12 +27031,12 @@
             <w:pPr>
               <w:jc w:val="center"/>
               <w:rPr>
-                <w:ins w:id="631" w:author="Anthony Cossio" w:date="2025-04-02T09:34:00Z"/>
+                <w:ins w:id="634" w:author="Anthony Cossio" w:date="2025-04-02T09:34:00Z"/>
                 <w:sz w:val="24"/>
                 <w:szCs w:val="24"/>
               </w:rPr>
             </w:pPr>
-            <w:ins w:id="632" w:author="Anthony Cossio" w:date="2025-04-02T09:34:00Z">
+            <w:ins w:id="635" w:author="Anthony Cossio" w:date="2025-04-02T09:34:00Z">
               <w:r>
                 <w:rPr>
                   <w:sz w:val="24"/>
@@ -27404,12 +27056,12 @@
             <w:pPr>
               <w:jc w:val="center"/>
               <w:rPr>
-                <w:ins w:id="633" w:author="Anthony Cossio" w:date="2025-04-02T09:34:00Z"/>
+                <w:ins w:id="636" w:author="Anthony Cossio" w:date="2025-04-02T09:34:00Z"/>
                 <w:sz w:val="24"/>
                 <w:szCs w:val="24"/>
               </w:rPr>
             </w:pPr>
-            <w:ins w:id="634" w:author="Anthony Cossio" w:date="2025-04-02T09:34:00Z">
+            <w:ins w:id="637" w:author="Anthony Cossio" w:date="2025-04-02T09:34:00Z">
               <w:r>
                 <w:rPr>
                   <w:sz w:val="24"/>
@@ -27428,12 +27080,12 @@
             <w:pPr>
               <w:jc w:val="center"/>
               <w:rPr>
-                <w:ins w:id="635" w:author="Anthony Cossio" w:date="2025-04-02T09:34:00Z"/>
+                <w:ins w:id="638" w:author="Anthony Cossio" w:date="2025-04-02T09:34:00Z"/>
                 <w:sz w:val="24"/>
                 <w:szCs w:val="24"/>
               </w:rPr>
             </w:pPr>
-            <w:ins w:id="636" w:author="Anthony Cossio" w:date="2025-04-02T09:34:00Z">
+            <w:ins w:id="639" w:author="Anthony Cossio" w:date="2025-04-02T09:34:00Z">
               <w:r>
                 <w:rPr>
                   <w:sz w:val="24"/>
@@ -27453,12 +27105,12 @@
             <w:pPr>
               <w:jc w:val="center"/>
               <w:rPr>
-                <w:ins w:id="637" w:author="Anthony Cossio" w:date="2025-04-02T09:34:00Z"/>
+                <w:ins w:id="640" w:author="Anthony Cossio" w:date="2025-04-02T09:34:00Z"/>
                 <w:sz w:val="24"/>
                 <w:szCs w:val="24"/>
               </w:rPr>
             </w:pPr>
-            <w:ins w:id="638" w:author="Anthony Cossio" w:date="2025-04-02T09:34:00Z">
+            <w:ins w:id="641" w:author="Anthony Cossio" w:date="2025-04-02T09:34:00Z">
               <w:r>
                 <w:rPr>
                   <w:sz w:val="24"/>
@@ -27477,12 +27129,12 @@
             <w:pPr>
               <w:jc w:val="center"/>
               <w:rPr>
-                <w:ins w:id="639" w:author="Anthony Cossio" w:date="2025-04-02T09:34:00Z"/>
+                <w:ins w:id="642" w:author="Anthony Cossio" w:date="2025-04-02T09:34:00Z"/>
                 <w:sz w:val="24"/>
                 <w:szCs w:val="24"/>
               </w:rPr>
             </w:pPr>
-            <w:ins w:id="640" w:author="Anthony Cossio" w:date="2025-04-02T09:34:00Z">
+            <w:ins w:id="643" w:author="Anthony Cossio" w:date="2025-04-02T09:34:00Z">
               <w:r>
                 <w:rPr>
                   <w:sz w:val="24"/>
@@ -27498,7 +27150,7 @@
         <w:trPr>
           <w:trHeight w:val="288"/>
           <w:jc w:val="center"/>
-          <w:ins w:id="641" w:author="Anthony Cossio" w:date="2025-04-02T09:34:00Z"/>
+          <w:ins w:id="644" w:author="Anthony Cossio" w:date="2025-04-02T09:34:00Z"/>
         </w:trPr>
         <w:tc>
           <w:tcPr>
@@ -27509,12 +27161,12 @@
           <w:p>
             <w:pPr>
               <w:rPr>
-                <w:ins w:id="642" w:author="Anthony Cossio" w:date="2025-04-02T09:34:00Z"/>
+                <w:ins w:id="645" w:author="Anthony Cossio" w:date="2025-04-02T09:34:00Z"/>
                 <w:sz w:val="24"/>
                 <w:szCs w:val="24"/>
               </w:rPr>
             </w:pPr>
-            <w:ins w:id="643" w:author="Anthony Cossio" w:date="2025-04-02T09:34:00Z">
+            <w:ins w:id="646" w:author="Anthony Cossio" w:date="2025-04-02T09:34:00Z">
               <w:r>
                 <w:rPr>
                   <w:sz w:val="24"/>
@@ -27534,12 +27186,12 @@
             <w:pPr>
               <w:jc w:val="center"/>
               <w:rPr>
-                <w:ins w:id="644" w:author="Anthony Cossio" w:date="2025-04-02T09:34:00Z"/>
+                <w:ins w:id="647" w:author="Anthony Cossio" w:date="2025-04-02T09:34:00Z"/>
                 <w:sz w:val="24"/>
                 <w:szCs w:val="24"/>
               </w:rPr>
             </w:pPr>
-            <w:ins w:id="645" w:author="Anthony Cossio" w:date="2025-04-02T09:34:00Z">
+            <w:ins w:id="648" w:author="Anthony Cossio" w:date="2025-04-02T09:34:00Z">
               <w:r>
                 <w:rPr>
                   <w:sz w:val="24"/>
@@ -27558,12 +27210,12 @@
             <w:pPr>
               <w:jc w:val="center"/>
               <w:rPr>
-                <w:ins w:id="646" w:author="Anthony Cossio" w:date="2025-04-02T09:34:00Z"/>
+                <w:ins w:id="649" w:author="Anthony Cossio" w:date="2025-04-02T09:34:00Z"/>
                 <w:sz w:val="24"/>
                 <w:szCs w:val="24"/>
               </w:rPr>
             </w:pPr>
-            <w:ins w:id="647" w:author="Anthony Cossio" w:date="2025-04-02T09:34:00Z">
+            <w:ins w:id="650" w:author="Anthony Cossio" w:date="2025-04-02T09:34:00Z">
               <w:r>
                 <w:rPr>
                   <w:sz w:val="24"/>
@@ -27583,12 +27235,12 @@
             <w:pPr>
               <w:jc w:val="center"/>
               <w:rPr>
-                <w:ins w:id="648" w:author="Anthony Cossio" w:date="2025-04-02T09:34:00Z"/>
+                <w:ins w:id="651" w:author="Anthony Cossio" w:date="2025-04-02T09:34:00Z"/>
                 <w:sz w:val="24"/>
                 <w:szCs w:val="24"/>
               </w:rPr>
             </w:pPr>
-            <w:ins w:id="649" w:author="Anthony Cossio" w:date="2025-04-02T09:34:00Z">
+            <w:ins w:id="652" w:author="Anthony Cossio" w:date="2025-04-02T09:34:00Z">
               <w:r>
                 <w:rPr>
                   <w:sz w:val="24"/>
@@ -27608,12 +27260,12 @@
             <w:pPr>
               <w:jc w:val="center"/>
               <w:rPr>
-                <w:ins w:id="650" w:author="Anthony Cossio" w:date="2025-04-02T09:34:00Z"/>
+                <w:ins w:id="653" w:author="Anthony Cossio" w:date="2025-04-02T09:34:00Z"/>
                 <w:sz w:val="24"/>
                 <w:szCs w:val="24"/>
               </w:rPr>
             </w:pPr>
-            <w:ins w:id="651" w:author="Anthony Cossio" w:date="2025-04-02T09:34:00Z">
+            <w:ins w:id="654" w:author="Anthony Cossio" w:date="2025-04-02T09:34:00Z">
               <w:r>
                 <w:rPr>
                   <w:sz w:val="24"/>
@@ -27632,12 +27284,12 @@
             <w:pPr>
               <w:jc w:val="center"/>
               <w:rPr>
-                <w:ins w:id="652" w:author="Anthony Cossio" w:date="2025-04-02T09:34:00Z"/>
+                <w:ins w:id="655" w:author="Anthony Cossio" w:date="2025-04-02T09:34:00Z"/>
                 <w:sz w:val="24"/>
                 <w:szCs w:val="24"/>
               </w:rPr>
             </w:pPr>
-            <w:ins w:id="653" w:author="Anthony Cossio" w:date="2025-04-02T09:34:00Z">
+            <w:ins w:id="656" w:author="Anthony Cossio" w:date="2025-04-02T09:34:00Z">
               <w:r>
                 <w:rPr>
                   <w:sz w:val="24"/>
@@ -27657,12 +27309,12 @@
             <w:pPr>
               <w:jc w:val="center"/>
               <w:rPr>
-                <w:ins w:id="654" w:author="Anthony Cossio" w:date="2025-04-02T09:34:00Z"/>
+                <w:ins w:id="657" w:author="Anthony Cossio" w:date="2025-04-02T09:34:00Z"/>
                 <w:sz w:val="24"/>
                 <w:szCs w:val="24"/>
               </w:rPr>
             </w:pPr>
-            <w:ins w:id="655" w:author="Anthony Cossio" w:date="2025-04-02T09:34:00Z">
+            <w:ins w:id="658" w:author="Anthony Cossio" w:date="2025-04-02T09:34:00Z">
               <w:r>
                 <w:rPr>
                   <w:sz w:val="24"/>
@@ -27681,12 +27333,12 @@
             <w:pPr>
               <w:jc w:val="center"/>
               <w:rPr>
-                <w:ins w:id="656" w:author="Anthony Cossio" w:date="2025-04-02T09:34:00Z"/>
+                <w:ins w:id="659" w:author="Anthony Cossio" w:date="2025-04-02T09:34:00Z"/>
                 <w:sz w:val="24"/>
                 <w:szCs w:val="24"/>
               </w:rPr>
             </w:pPr>
-            <w:ins w:id="657" w:author="Anthony Cossio" w:date="2025-04-02T09:34:00Z">
+            <w:ins w:id="660" w:author="Anthony Cossio" w:date="2025-04-02T09:34:00Z">
               <w:r>
                 <w:rPr>
                   <w:sz w:val="24"/>
@@ -28013,7 +27665,7 @@
         <w:ind w:left="100" w:right="485"/>
         <w:rPr>
           <w:strike/>
-          <w:rPrChange w:id="658" w:author="Anthony Cossio" w:date="2025-04-03T12:55:00Z">
+          <w:rPrChange w:id="661" w:author="Anthony Cossio" w:date="2025-04-03T12:55:00Z">
             <w:rPr/>
           </w:rPrChange>
         </w:rPr>
@@ -28021,7 +27673,7 @@
       <w:r>
         <w:rPr>
           <w:strike/>
-          <w:rPrChange w:id="659" w:author="Anthony Cossio" w:date="2025-04-03T12:55:00Z">
+          <w:rPrChange w:id="662" w:author="Anthony Cossio" w:date="2025-04-03T12:55:00Z">
             <w:rPr/>
           </w:rPrChange>
         </w:rPr>
@@ -28031,7 +27683,7 @@
         <w:rPr>
           <w:strike/>
           <w:spacing w:val="-2"/>
-          <w:rPrChange w:id="660" w:author="Anthony Cossio" w:date="2025-04-03T12:55:00Z">
+          <w:rPrChange w:id="663" w:author="Anthony Cossio" w:date="2025-04-03T12:55:00Z">
             <w:rPr>
               <w:spacing w:val="-2"/>
             </w:rPr>
@@ -28042,7 +27694,7 @@
       <w:r>
         <w:rPr>
           <w:strike/>
-          <w:rPrChange w:id="661" w:author="Anthony Cossio" w:date="2025-04-03T12:55:00Z">
+          <w:rPrChange w:id="664" w:author="Anthony Cossio" w:date="2025-04-03T12:55:00Z">
             <w:rPr/>
           </w:rPrChange>
         </w:rPr>
@@ -28052,7 +27704,7 @@
         <w:rPr>
           <w:strike/>
           <w:spacing w:val="-2"/>
-          <w:rPrChange w:id="662" w:author="Anthony Cossio" w:date="2025-04-03T12:55:00Z">
+          <w:rPrChange w:id="665" w:author="Anthony Cossio" w:date="2025-04-03T12:55:00Z">
             <w:rPr>
               <w:spacing w:val="-2"/>
             </w:rPr>
@@ -28063,7 +27715,7 @@
       <w:r>
         <w:rPr>
           <w:strike/>
-          <w:rPrChange w:id="663" w:author="Anthony Cossio" w:date="2025-04-03T12:55:00Z">
+          <w:rPrChange w:id="666" w:author="Anthony Cossio" w:date="2025-04-03T12:55:00Z">
             <w:rPr/>
           </w:rPrChange>
         </w:rPr>
@@ -28073,7 +27725,7 @@
         <w:rPr>
           <w:strike/>
           <w:spacing w:val="-2"/>
-          <w:rPrChange w:id="664" w:author="Anthony Cossio" w:date="2025-04-03T12:55:00Z">
+          <w:rPrChange w:id="667" w:author="Anthony Cossio" w:date="2025-04-03T12:55:00Z">
             <w:rPr>
               <w:spacing w:val="-2"/>
             </w:rPr>
@@ -28084,7 +27736,7 @@
       <w:r>
         <w:rPr>
           <w:strike/>
-          <w:rPrChange w:id="665" w:author="Anthony Cossio" w:date="2025-04-03T12:55:00Z">
+          <w:rPrChange w:id="668" w:author="Anthony Cossio" w:date="2025-04-03T12:55:00Z">
             <w:rPr/>
           </w:rPrChange>
         </w:rPr>
@@ -28094,7 +27746,7 @@
         <w:rPr>
           <w:strike/>
           <w:spacing w:val="-2"/>
-          <w:rPrChange w:id="666" w:author="Anthony Cossio" w:date="2025-04-03T12:55:00Z">
+          <w:rPrChange w:id="669" w:author="Anthony Cossio" w:date="2025-04-03T12:55:00Z">
             <w:rPr>
               <w:spacing w:val="-2"/>
             </w:rPr>
@@ -28105,7 +27757,7 @@
       <w:r>
         <w:rPr>
           <w:strike/>
-          <w:rPrChange w:id="667" w:author="Anthony Cossio" w:date="2025-04-03T12:55:00Z">
+          <w:rPrChange w:id="670" w:author="Anthony Cossio" w:date="2025-04-03T12:55:00Z">
             <w:rPr/>
           </w:rPrChange>
         </w:rPr>
@@ -28115,7 +27767,7 @@
         <w:rPr>
           <w:strike/>
           <w:spacing w:val="-4"/>
-          <w:rPrChange w:id="668" w:author="Anthony Cossio" w:date="2025-04-03T12:55:00Z">
+          <w:rPrChange w:id="671" w:author="Anthony Cossio" w:date="2025-04-03T12:55:00Z">
             <w:rPr>
               <w:spacing w:val="-4"/>
             </w:rPr>
@@ -28126,7 +27778,7 @@
       <w:r>
         <w:rPr>
           <w:strike/>
-          <w:rPrChange w:id="669" w:author="Anthony Cossio" w:date="2025-04-03T12:55:00Z">
+          <w:rPrChange w:id="672" w:author="Anthony Cossio" w:date="2025-04-03T12:55:00Z">
             <w:rPr/>
           </w:rPrChange>
         </w:rPr>
@@ -28136,7 +27788,7 @@
         <w:rPr>
           <w:strike/>
           <w:spacing w:val="-2"/>
-          <w:rPrChange w:id="670" w:author="Anthony Cossio" w:date="2025-04-03T12:55:00Z">
+          <w:rPrChange w:id="673" w:author="Anthony Cossio" w:date="2025-04-03T12:55:00Z">
             <w:rPr>
               <w:spacing w:val="-2"/>
             </w:rPr>
@@ -28147,7 +27799,7 @@
       <w:r>
         <w:rPr>
           <w:strike/>
-          <w:rPrChange w:id="671" w:author="Anthony Cossio" w:date="2025-04-03T12:55:00Z">
+          <w:rPrChange w:id="674" w:author="Anthony Cossio" w:date="2025-04-03T12:55:00Z">
             <w:rPr/>
           </w:rPrChange>
         </w:rPr>
@@ -28157,7 +27809,7 @@
         <w:rPr>
           <w:strike/>
           <w:spacing w:val="-2"/>
-          <w:rPrChange w:id="672" w:author="Anthony Cossio" w:date="2025-04-03T12:55:00Z">
+          <w:rPrChange w:id="675" w:author="Anthony Cossio" w:date="2025-04-03T12:55:00Z">
             <w:rPr>
               <w:spacing w:val="-2"/>
             </w:rPr>
@@ -28168,7 +27820,7 @@
       <w:r>
         <w:rPr>
           <w:strike/>
-          <w:rPrChange w:id="673" w:author="Anthony Cossio" w:date="2025-04-03T12:55:00Z">
+          <w:rPrChange w:id="676" w:author="Anthony Cossio" w:date="2025-04-03T12:55:00Z">
             <w:rPr/>
           </w:rPrChange>
         </w:rPr>
@@ -28178,7 +27830,7 @@
         <w:rPr>
           <w:strike/>
           <w:spacing w:val="-2"/>
-          <w:rPrChange w:id="674" w:author="Anthony Cossio" w:date="2025-04-03T12:55:00Z">
+          <w:rPrChange w:id="677" w:author="Anthony Cossio" w:date="2025-04-03T12:55:00Z">
             <w:rPr>
               <w:spacing w:val="-2"/>
             </w:rPr>
@@ -28189,7 +27841,7 @@
       <w:r>
         <w:rPr>
           <w:strike/>
-          <w:rPrChange w:id="675" w:author="Anthony Cossio" w:date="2025-04-03T12:55:00Z">
+          <w:rPrChange w:id="678" w:author="Anthony Cossio" w:date="2025-04-03T12:55:00Z">
             <w:rPr/>
           </w:rPrChange>
         </w:rPr>
@@ -28199,7 +27851,7 @@
         <w:rPr>
           <w:strike/>
           <w:spacing w:val="-2"/>
-          <w:rPrChange w:id="676" w:author="Anthony Cossio" w:date="2025-04-03T12:55:00Z">
+          <w:rPrChange w:id="679" w:author="Anthony Cossio" w:date="2025-04-03T12:55:00Z">
             <w:rPr>
               <w:spacing w:val="-2"/>
             </w:rPr>
@@ -28210,7 +27862,7 @@
       <w:r>
         <w:rPr>
           <w:strike/>
-          <w:rPrChange w:id="677" w:author="Anthony Cossio" w:date="2025-04-03T12:55:00Z">
+          <w:rPrChange w:id="680" w:author="Anthony Cossio" w:date="2025-04-03T12:55:00Z">
             <w:rPr/>
           </w:rPrChange>
         </w:rPr>
@@ -28220,7 +27872,7 @@
         <w:rPr>
           <w:strike/>
           <w:spacing w:val="-2"/>
-          <w:rPrChange w:id="678" w:author="Anthony Cossio" w:date="2025-04-03T12:55:00Z">
+          <w:rPrChange w:id="681" w:author="Anthony Cossio" w:date="2025-04-03T12:55:00Z">
             <w:rPr>
               <w:spacing w:val="-2"/>
             </w:rPr>
@@ -28231,7 +27883,7 @@
       <w:r>
         <w:rPr>
           <w:strike/>
-          <w:rPrChange w:id="679" w:author="Anthony Cossio" w:date="2025-04-03T12:55:00Z">
+          <w:rPrChange w:id="682" w:author="Anthony Cossio" w:date="2025-04-03T12:55:00Z">
             <w:rPr/>
           </w:rPrChange>
         </w:rPr>
@@ -28241,7 +27893,7 @@
         <w:rPr>
           <w:strike/>
           <w:spacing w:val="-4"/>
-          <w:rPrChange w:id="680" w:author="Anthony Cossio" w:date="2025-04-03T12:55:00Z">
+          <w:rPrChange w:id="683" w:author="Anthony Cossio" w:date="2025-04-03T12:55:00Z">
             <w:rPr>
               <w:spacing w:val="-4"/>
             </w:rPr>
@@ -28252,7 +27904,7 @@
       <w:r>
         <w:rPr>
           <w:strike/>
-          <w:rPrChange w:id="681" w:author="Anthony Cossio" w:date="2025-04-03T12:55:00Z">
+          <w:rPrChange w:id="684" w:author="Anthony Cossio" w:date="2025-04-03T12:55:00Z">
             <w:rPr/>
           </w:rPrChange>
         </w:rPr>
@@ -28262,7 +27914,7 @@
         <w:rPr>
           <w:strike/>
           <w:spacing w:val="-2"/>
-          <w:rPrChange w:id="682" w:author="Anthony Cossio" w:date="2025-04-03T12:55:00Z">
+          <w:rPrChange w:id="685" w:author="Anthony Cossio" w:date="2025-04-03T12:55:00Z">
             <w:rPr>
               <w:spacing w:val="-2"/>
             </w:rPr>
@@ -28273,7 +27925,7 @@
       <w:r>
         <w:rPr>
           <w:strike/>
-          <w:rPrChange w:id="683" w:author="Anthony Cossio" w:date="2025-04-03T12:55:00Z">
+          <w:rPrChange w:id="686" w:author="Anthony Cossio" w:date="2025-04-03T12:55:00Z">
             <w:rPr/>
           </w:rPrChange>
         </w:rPr>
@@ -28283,7 +27935,7 @@
         <w:rPr>
           <w:strike/>
           <w:spacing w:val="-2"/>
-          <w:rPrChange w:id="684" w:author="Anthony Cossio" w:date="2025-04-03T12:55:00Z">
+          <w:rPrChange w:id="687" w:author="Anthony Cossio" w:date="2025-04-03T12:55:00Z">
             <w:rPr>
               <w:spacing w:val="-2"/>
             </w:rPr>
@@ -28294,7 +27946,7 @@
       <w:r>
         <w:rPr>
           <w:strike/>
-          <w:rPrChange w:id="685" w:author="Anthony Cossio" w:date="2025-04-03T12:55:00Z">
+          <w:rPrChange w:id="688" w:author="Anthony Cossio" w:date="2025-04-03T12:55:00Z">
             <w:rPr/>
           </w:rPrChange>
         </w:rPr>
@@ -28304,7 +27956,7 @@
         <w:rPr>
           <w:strike/>
           <w:spacing w:val="-4"/>
-          <w:rPrChange w:id="686" w:author="Anthony Cossio" w:date="2025-04-03T12:55:00Z">
+          <w:rPrChange w:id="689" w:author="Anthony Cossio" w:date="2025-04-03T12:55:00Z">
             <w:rPr>
               <w:spacing w:val="-4"/>
             </w:rPr>
@@ -28315,7 +27967,7 @@
       <w:r>
         <w:rPr>
           <w:strike/>
-          <w:rPrChange w:id="687" w:author="Anthony Cossio" w:date="2025-04-03T12:55:00Z">
+          <w:rPrChange w:id="690" w:author="Anthony Cossio" w:date="2025-04-03T12:55:00Z">
             <w:rPr/>
           </w:rPrChange>
         </w:rPr>
@@ -28325,7 +27977,7 @@
         <w:rPr>
           <w:strike/>
           <w:spacing w:val="-2"/>
-          <w:rPrChange w:id="688" w:author="Anthony Cossio" w:date="2025-04-03T12:55:00Z">
+          <w:rPrChange w:id="691" w:author="Anthony Cossio" w:date="2025-04-03T12:55:00Z">
             <w:rPr>
               <w:spacing w:val="-2"/>
             </w:rPr>
@@ -28336,7 +27988,7 @@
       <w:r>
         <w:rPr>
           <w:strike/>
-          <w:rPrChange w:id="689" w:author="Anthony Cossio" w:date="2025-04-03T12:55:00Z">
+          <w:rPrChange w:id="692" w:author="Anthony Cossio" w:date="2025-04-03T12:55:00Z">
             <w:rPr/>
           </w:rPrChange>
         </w:rPr>
@@ -28346,7 +27998,7 @@
         <w:rPr>
           <w:strike/>
           <w:spacing w:val="-2"/>
-          <w:rPrChange w:id="690" w:author="Anthony Cossio" w:date="2025-04-03T12:55:00Z">
+          <w:rPrChange w:id="693" w:author="Anthony Cossio" w:date="2025-04-03T12:55:00Z">
             <w:rPr>
               <w:spacing w:val="-2"/>
             </w:rPr>
@@ -28357,7 +28009,7 @@
       <w:r>
         <w:rPr>
           <w:strike/>
-          <w:rPrChange w:id="691" w:author="Anthony Cossio" w:date="2025-04-03T12:55:00Z">
+          <w:rPrChange w:id="694" w:author="Anthony Cossio" w:date="2025-04-03T12:55:00Z">
             <w:rPr/>
           </w:rPrChange>
         </w:rPr>
@@ -28367,7 +28019,7 @@
         <w:rPr>
           <w:strike/>
           <w:spacing w:val="-2"/>
-          <w:rPrChange w:id="692" w:author="Anthony Cossio" w:date="2025-04-03T12:55:00Z">
+          <w:rPrChange w:id="695" w:author="Anthony Cossio" w:date="2025-04-03T12:55:00Z">
             <w:rPr>
               <w:spacing w:val="-2"/>
             </w:rPr>
@@ -28378,7 +28030,7 @@
       <w:r>
         <w:rPr>
           <w:strike/>
-          <w:rPrChange w:id="693" w:author="Anthony Cossio" w:date="2025-04-03T12:55:00Z">
+          <w:rPrChange w:id="696" w:author="Anthony Cossio" w:date="2025-04-03T12:55:00Z">
             <w:rPr/>
           </w:rPrChange>
         </w:rPr>
@@ -28388,7 +28040,7 @@
         <w:rPr>
           <w:strike/>
           <w:spacing w:val="-2"/>
-          <w:rPrChange w:id="694" w:author="Anthony Cossio" w:date="2025-04-03T12:55:00Z">
+          <w:rPrChange w:id="697" w:author="Anthony Cossio" w:date="2025-04-03T12:55:00Z">
             <w:rPr>
               <w:spacing w:val="-2"/>
             </w:rPr>
@@ -28399,7 +28051,7 @@
       <w:r>
         <w:rPr>
           <w:strike/>
-          <w:rPrChange w:id="695" w:author="Anthony Cossio" w:date="2025-04-03T12:55:00Z">
+          <w:rPrChange w:id="698" w:author="Anthony Cossio" w:date="2025-04-03T12:55:00Z">
             <w:rPr/>
           </w:rPrChange>
         </w:rPr>
@@ -28410,7 +28062,7 @@
       <w:pPr>
         <w:spacing w:line="259" w:lineRule="auto"/>
         <w:rPr>
-          <w:ins w:id="696" w:author="Anthony Cossio" w:date="2025-04-03T12:55:00Z"/>
+          <w:ins w:id="699" w:author="Anthony Cossio" w:date="2025-04-03T12:55:00Z"/>
         </w:rPr>
       </w:pPr>
     </w:p>
@@ -28418,7 +28070,7 @@
       <w:pPr>
         <w:spacing w:line="259" w:lineRule="auto"/>
         <w:rPr>
-          <w:ins w:id="697" w:author="Anthony Cossio" w:date="2025-04-03T12:55:00Z"/>
+          <w:ins w:id="700" w:author="Anthony Cossio" w:date="2025-04-03T12:55:00Z"/>
         </w:rPr>
       </w:pPr>
     </w:p>
@@ -28426,10 +28078,10 @@
       <w:pPr>
         <w:spacing w:line="259" w:lineRule="auto"/>
         <w:rPr>
-          <w:ins w:id="698" w:author="Anthony Cossio" w:date="2025-04-03T12:56:00Z"/>
+          <w:ins w:id="701" w:author="Anthony Cossio" w:date="2025-04-03T12:56:00Z"/>
         </w:rPr>
       </w:pPr>
-      <w:ins w:id="699" w:author="Anthony Cossio" w:date="2025-04-03T12:55:00Z">
+      <w:ins w:id="702" w:author="Anthony Cossio" w:date="2025-04-03T12:55:00Z">
         <w:r>
           <w:rPr>
             <w:noProof/>
@@ -28491,19 +28143,19 @@
         <w:spacing w:line="259" w:lineRule="auto"/>
         <w:ind w:left="100" w:right="485"/>
         <w:rPr>
-          <w:ins w:id="700" w:author="Anthony Cossio" w:date="2025-04-03T12:56:00Z"/>
-          <w:rPrChange w:id="701" w:author="Anthony Cossio" w:date="2025-04-03T12:56:00Z">
+          <w:ins w:id="703" w:author="Anthony Cossio" w:date="2025-04-03T12:56:00Z"/>
+          <w:rPrChange w:id="704" w:author="Anthony Cossio" w:date="2025-04-03T12:56:00Z">
             <w:rPr>
-              <w:ins w:id="702" w:author="Anthony Cossio" w:date="2025-04-03T12:56:00Z"/>
+              <w:ins w:id="705" w:author="Anthony Cossio" w:date="2025-04-03T12:56:00Z"/>
               <w:strike/>
             </w:rPr>
           </w:rPrChange>
         </w:rPr>
       </w:pPr>
-      <w:ins w:id="703" w:author="Anthony Cossio" w:date="2025-04-03T12:56:00Z">
-        <w:r>
-          <w:rPr>
-            <w:rPrChange w:id="704" w:author="Anthony Cossio" w:date="2025-04-03T12:56:00Z">
+      <w:ins w:id="706" w:author="Anthony Cossio" w:date="2025-04-03T12:56:00Z">
+        <w:r>
+          <w:rPr>
+            <w:rPrChange w:id="707" w:author="Anthony Cossio" w:date="2025-04-03T12:56:00Z">
               <w:rPr>
                 <w:strike/>
               </w:rPr>
@@ -28514,7 +28166,7 @@
         <w:r>
           <w:rPr>
             <w:spacing w:val="-2"/>
-            <w:rPrChange w:id="705" w:author="Anthony Cossio" w:date="2025-04-03T12:56:00Z">
+            <w:rPrChange w:id="708" w:author="Anthony Cossio" w:date="2025-04-03T12:56:00Z">
               <w:rPr>
                 <w:strike/>
                 <w:spacing w:val="-2"/>
@@ -28525,7 +28177,7 @@
         </w:r>
         <w:r>
           <w:rPr>
-            <w:rPrChange w:id="706" w:author="Anthony Cossio" w:date="2025-04-03T12:56:00Z">
+            <w:rPrChange w:id="709" w:author="Anthony Cossio" w:date="2025-04-03T12:56:00Z">
               <w:rPr>
                 <w:strike/>
               </w:rPr>
@@ -28536,7 +28188,7 @@
         <w:r>
           <w:rPr>
             <w:spacing w:val="-2"/>
-            <w:rPrChange w:id="707" w:author="Anthony Cossio" w:date="2025-04-03T12:56:00Z">
+            <w:rPrChange w:id="710" w:author="Anthony Cossio" w:date="2025-04-03T12:56:00Z">
               <w:rPr>
                 <w:strike/>
                 <w:spacing w:val="-2"/>
@@ -28547,7 +28199,7 @@
         </w:r>
         <w:r>
           <w:rPr>
-            <w:rPrChange w:id="708" w:author="Anthony Cossio" w:date="2025-04-03T12:56:00Z">
+            <w:rPrChange w:id="711" w:author="Anthony Cossio" w:date="2025-04-03T12:56:00Z">
               <w:rPr>
                 <w:strike/>
               </w:rPr>
@@ -28558,7 +28210,7 @@
         <w:r>
           <w:rPr>
             <w:spacing w:val="-2"/>
-            <w:rPrChange w:id="709" w:author="Anthony Cossio" w:date="2025-04-03T12:56:00Z">
+            <w:rPrChange w:id="712" w:author="Anthony Cossio" w:date="2025-04-03T12:56:00Z">
               <w:rPr>
                 <w:strike/>
                 <w:spacing w:val="-2"/>
@@ -28569,7 +28221,7 @@
         </w:r>
         <w:r>
           <w:rPr>
-            <w:rPrChange w:id="710" w:author="Anthony Cossio" w:date="2025-04-03T12:56:00Z">
+            <w:rPrChange w:id="713" w:author="Anthony Cossio" w:date="2025-04-03T12:56:00Z">
               <w:rPr>
                 <w:strike/>
               </w:rPr>
@@ -28580,7 +28232,7 @@
         <w:r>
           <w:rPr>
             <w:spacing w:val="-2"/>
-            <w:rPrChange w:id="711" w:author="Anthony Cossio" w:date="2025-04-03T12:56:00Z">
+            <w:rPrChange w:id="714" w:author="Anthony Cossio" w:date="2025-04-03T12:56:00Z">
               <w:rPr>
                 <w:strike/>
                 <w:spacing w:val="-2"/>
@@ -28591,7 +28243,7 @@
         </w:r>
         <w:r>
           <w:rPr>
-            <w:rPrChange w:id="712" w:author="Anthony Cossio" w:date="2025-04-03T12:56:00Z">
+            <w:rPrChange w:id="715" w:author="Anthony Cossio" w:date="2025-04-03T12:56:00Z">
               <w:rPr>
                 <w:strike/>
               </w:rPr>
@@ -28604,7 +28256,7 @@
         </w:r>
         <w:r>
           <w:rPr>
-            <w:rPrChange w:id="713" w:author="Anthony Cossio" w:date="2025-04-03T12:56:00Z">
+            <w:rPrChange w:id="716" w:author="Anthony Cossio" w:date="2025-04-03T12:56:00Z">
               <w:rPr>
                 <w:strike/>
               </w:rPr>
@@ -28615,7 +28267,7 @@
         <w:r>
           <w:rPr>
             <w:spacing w:val="-4"/>
-            <w:rPrChange w:id="714" w:author="Anthony Cossio" w:date="2025-04-03T12:56:00Z">
+            <w:rPrChange w:id="717" w:author="Anthony Cossio" w:date="2025-04-03T12:56:00Z">
               <w:rPr>
                 <w:strike/>
                 <w:spacing w:val="-4"/>
@@ -28626,7 +28278,7 @@
         </w:r>
         <w:r>
           <w:rPr>
-            <w:rPrChange w:id="715" w:author="Anthony Cossio" w:date="2025-04-03T12:56:00Z">
+            <w:rPrChange w:id="718" w:author="Anthony Cossio" w:date="2025-04-03T12:56:00Z">
               <w:rPr>
                 <w:strike/>
               </w:rPr>
@@ -28637,7 +28289,7 @@
         <w:r>
           <w:rPr>
             <w:spacing w:val="-2"/>
-            <w:rPrChange w:id="716" w:author="Anthony Cossio" w:date="2025-04-03T12:56:00Z">
+            <w:rPrChange w:id="719" w:author="Anthony Cossio" w:date="2025-04-03T12:56:00Z">
               <w:rPr>
                 <w:strike/>
                 <w:spacing w:val="-2"/>
@@ -28648,7 +28300,7 @@
         </w:r>
         <w:r>
           <w:rPr>
-            <w:rPrChange w:id="717" w:author="Anthony Cossio" w:date="2025-04-03T12:56:00Z">
+            <w:rPrChange w:id="720" w:author="Anthony Cossio" w:date="2025-04-03T12:56:00Z">
               <w:rPr>
                 <w:strike/>
               </w:rPr>
@@ -28659,7 +28311,7 @@
         <w:r>
           <w:rPr>
             <w:spacing w:val="-2"/>
-            <w:rPrChange w:id="718" w:author="Anthony Cossio" w:date="2025-04-03T12:56:00Z">
+            <w:rPrChange w:id="721" w:author="Anthony Cossio" w:date="2025-04-03T12:56:00Z">
               <w:rPr>
                 <w:strike/>
                 <w:spacing w:val="-2"/>
@@ -28670,7 +28322,7 @@
         </w:r>
         <w:r>
           <w:rPr>
-            <w:rPrChange w:id="719" w:author="Anthony Cossio" w:date="2025-04-03T12:56:00Z">
+            <w:rPrChange w:id="722" w:author="Anthony Cossio" w:date="2025-04-03T12:56:00Z">
               <w:rPr>
                 <w:strike/>
               </w:rPr>
@@ -28681,7 +28333,7 @@
         <w:r>
           <w:rPr>
             <w:spacing w:val="-2"/>
-            <w:rPrChange w:id="720" w:author="Anthony Cossio" w:date="2025-04-03T12:56:00Z">
+            <w:rPrChange w:id="723" w:author="Anthony Cossio" w:date="2025-04-03T12:56:00Z">
               <w:rPr>
                 <w:strike/>
                 <w:spacing w:val="-2"/>
@@ -28692,7 +28344,7 @@
         </w:r>
         <w:r>
           <w:rPr>
-            <w:rPrChange w:id="721" w:author="Anthony Cossio" w:date="2025-04-03T12:56:00Z">
+            <w:rPrChange w:id="724" w:author="Anthony Cossio" w:date="2025-04-03T12:56:00Z">
               <w:rPr>
                 <w:strike/>
               </w:rPr>
@@ -28703,7 +28355,7 @@
         <w:r>
           <w:rPr>
             <w:spacing w:val="-2"/>
-            <w:rPrChange w:id="722" w:author="Anthony Cossio" w:date="2025-04-03T12:56:00Z">
+            <w:rPrChange w:id="725" w:author="Anthony Cossio" w:date="2025-04-03T12:56:00Z">
               <w:rPr>
                 <w:strike/>
                 <w:spacing w:val="-2"/>
@@ -28714,7 +28366,7 @@
         </w:r>
         <w:r>
           <w:rPr>
-            <w:rPrChange w:id="723" w:author="Anthony Cossio" w:date="2025-04-03T12:56:00Z">
+            <w:rPrChange w:id="726" w:author="Anthony Cossio" w:date="2025-04-03T12:56:00Z">
               <w:rPr>
                 <w:strike/>
               </w:rPr>
@@ -28725,7 +28377,7 @@
         <w:r>
           <w:rPr>
             <w:spacing w:val="-2"/>
-            <w:rPrChange w:id="724" w:author="Anthony Cossio" w:date="2025-04-03T12:56:00Z">
+            <w:rPrChange w:id="727" w:author="Anthony Cossio" w:date="2025-04-03T12:56:00Z">
               <w:rPr>
                 <w:strike/>
                 <w:spacing w:val="-2"/>
@@ -28736,7 +28388,7 @@
         </w:r>
         <w:r>
           <w:rPr>
-            <w:rPrChange w:id="725" w:author="Anthony Cossio" w:date="2025-04-03T12:56:00Z">
+            <w:rPrChange w:id="728" w:author="Anthony Cossio" w:date="2025-04-03T12:56:00Z">
               <w:rPr>
                 <w:strike/>
               </w:rPr>
@@ -28747,7 +28399,7 @@
         <w:r>
           <w:rPr>
             <w:spacing w:val="-4"/>
-            <w:rPrChange w:id="726" w:author="Anthony Cossio" w:date="2025-04-03T12:56:00Z">
+            <w:rPrChange w:id="729" w:author="Anthony Cossio" w:date="2025-04-03T12:56:00Z">
               <w:rPr>
                 <w:strike/>
                 <w:spacing w:val="-4"/>
@@ -28758,7 +28410,7 @@
         </w:r>
         <w:r>
           <w:rPr>
-            <w:rPrChange w:id="727" w:author="Anthony Cossio" w:date="2025-04-03T12:56:00Z">
+            <w:rPrChange w:id="730" w:author="Anthony Cossio" w:date="2025-04-03T12:56:00Z">
               <w:rPr>
                 <w:strike/>
               </w:rPr>
@@ -28769,7 +28421,7 @@
         <w:r>
           <w:rPr>
             <w:spacing w:val="-2"/>
-            <w:rPrChange w:id="728" w:author="Anthony Cossio" w:date="2025-04-03T12:56:00Z">
+            <w:rPrChange w:id="731" w:author="Anthony Cossio" w:date="2025-04-03T12:56:00Z">
               <w:rPr>
                 <w:strike/>
                 <w:spacing w:val="-2"/>
@@ -28780,7 +28432,7 @@
         </w:r>
         <w:r>
           <w:rPr>
-            <w:rPrChange w:id="729" w:author="Anthony Cossio" w:date="2025-04-03T12:56:00Z">
+            <w:rPrChange w:id="732" w:author="Anthony Cossio" w:date="2025-04-03T12:56:00Z">
               <w:rPr>
                 <w:strike/>
               </w:rPr>
@@ -28791,7 +28443,7 @@
         <w:r>
           <w:rPr>
             <w:spacing w:val="-2"/>
-            <w:rPrChange w:id="730" w:author="Anthony Cossio" w:date="2025-04-03T12:56:00Z">
+            <w:rPrChange w:id="733" w:author="Anthony Cossio" w:date="2025-04-03T12:56:00Z">
               <w:rPr>
                 <w:strike/>
                 <w:spacing w:val="-2"/>
@@ -28802,7 +28454,7 @@
         </w:r>
         <w:r>
           <w:rPr>
-            <w:rPrChange w:id="731" w:author="Anthony Cossio" w:date="2025-04-03T12:56:00Z">
+            <w:rPrChange w:id="734" w:author="Anthony Cossio" w:date="2025-04-03T12:56:00Z">
               <w:rPr>
                 <w:strike/>
               </w:rPr>
@@ -28813,7 +28465,7 @@
         <w:r>
           <w:rPr>
             <w:spacing w:val="-4"/>
-            <w:rPrChange w:id="732" w:author="Anthony Cossio" w:date="2025-04-03T12:56:00Z">
+            <w:rPrChange w:id="735" w:author="Anthony Cossio" w:date="2025-04-03T12:56:00Z">
               <w:rPr>
                 <w:strike/>
                 <w:spacing w:val="-4"/>
@@ -28824,7 +28476,7 @@
         </w:r>
         <w:r>
           <w:rPr>
-            <w:rPrChange w:id="733" w:author="Anthony Cossio" w:date="2025-04-03T12:56:00Z">
+            <w:rPrChange w:id="736" w:author="Anthony Cossio" w:date="2025-04-03T12:56:00Z">
               <w:rPr>
                 <w:strike/>
               </w:rPr>
@@ -28835,7 +28487,7 @@
         <w:r>
           <w:rPr>
             <w:spacing w:val="-2"/>
-            <w:rPrChange w:id="734" w:author="Anthony Cossio" w:date="2025-04-03T12:56:00Z">
+            <w:rPrChange w:id="737" w:author="Anthony Cossio" w:date="2025-04-03T12:56:00Z">
               <w:rPr>
                 <w:strike/>
                 <w:spacing w:val="-2"/>
@@ -28846,7 +28498,7 @@
         </w:r>
         <w:r>
           <w:rPr>
-            <w:rPrChange w:id="735" w:author="Anthony Cossio" w:date="2025-04-03T12:56:00Z">
+            <w:rPrChange w:id="738" w:author="Anthony Cossio" w:date="2025-04-03T12:56:00Z">
               <w:rPr>
                 <w:strike/>
               </w:rPr>
@@ -28857,7 +28509,7 @@
         <w:r>
           <w:rPr>
             <w:spacing w:val="-2"/>
-            <w:rPrChange w:id="736" w:author="Anthony Cossio" w:date="2025-04-03T12:56:00Z">
+            <w:rPrChange w:id="739" w:author="Anthony Cossio" w:date="2025-04-03T12:56:00Z">
               <w:rPr>
                 <w:strike/>
                 <w:spacing w:val="-2"/>
@@ -28868,7 +28520,7 @@
         </w:r>
         <w:r>
           <w:rPr>
-            <w:rPrChange w:id="737" w:author="Anthony Cossio" w:date="2025-04-03T12:56:00Z">
+            <w:rPrChange w:id="740" w:author="Anthony Cossio" w:date="2025-04-03T12:56:00Z">
               <w:rPr>
                 <w:strike/>
               </w:rPr>
@@ -28879,7 +28531,7 @@
         <w:r>
           <w:rPr>
             <w:spacing w:val="-2"/>
-            <w:rPrChange w:id="738" w:author="Anthony Cossio" w:date="2025-04-03T12:56:00Z">
+            <w:rPrChange w:id="741" w:author="Anthony Cossio" w:date="2025-04-03T12:56:00Z">
               <w:rPr>
                 <w:strike/>
                 <w:spacing w:val="-2"/>
@@ -28890,7 +28542,7 @@
         </w:r>
         <w:r>
           <w:rPr>
-            <w:rPrChange w:id="739" w:author="Anthony Cossio" w:date="2025-04-03T12:56:00Z">
+            <w:rPrChange w:id="742" w:author="Anthony Cossio" w:date="2025-04-03T12:56:00Z">
               <w:rPr>
                 <w:strike/>
               </w:rPr>
@@ -28901,7 +28553,7 @@
         <w:r>
           <w:rPr>
             <w:spacing w:val="-2"/>
-            <w:rPrChange w:id="740" w:author="Anthony Cossio" w:date="2025-04-03T12:56:00Z">
+            <w:rPrChange w:id="743" w:author="Anthony Cossio" w:date="2025-04-03T12:56:00Z">
               <w:rPr>
                 <w:strike/>
                 <w:spacing w:val="-2"/>
@@ -28910,15 +28562,37 @@
           </w:rPr>
           <w:t xml:space="preserve"> </w:t>
         </w:r>
-        <w:r>
-          <w:rPr>
-            <w:rPrChange w:id="741" w:author="Anthony Cossio" w:date="2025-04-03T12:56:00Z">
+        <w:commentRangeStart w:id="744"/>
+        <w:r>
+          <w:rPr>
+            <w:rPrChange w:id="745" w:author="Anthony Cossio" w:date="2025-04-03T12:56:00Z">
               <w:rPr>
                 <w:strike/>
               </w:rPr>
             </w:rPrChange>
           </w:rPr>
-          <w:t>with AMLR03 dive profile locations (blue *) overlayed.</w:t>
+          <w:t xml:space="preserve">with </w:t>
+        </w:r>
+      </w:ins>
+      <w:commentRangeEnd w:id="744"/>
+      <w:ins w:id="746" w:author="Anthony Cossio" w:date="2025-05-15T13:24:00Z">
+        <w:r>
+          <w:rPr>
+            <w:rStyle w:val="CommentReference"/>
+          </w:rPr>
+          <w:commentReference w:id="744"/>
+        </w:r>
+      </w:ins>
+      <w:ins w:id="747" w:author="Anthony Cossio" w:date="2025-04-03T12:56:00Z">
+        <w:r>
+          <w:rPr>
+            <w:rPrChange w:id="748" w:author="Anthony Cossio" w:date="2025-04-03T12:56:00Z">
+              <w:rPr>
+                <w:strike/>
+              </w:rPr>
+            </w:rPrChange>
+          </w:rPr>
+          <w:t>AMLR03 dive profile locations (blue *) overlayed.</w:t>
         </w:r>
       </w:ins>
     </w:p>
@@ -29156,8 +28830,16 @@
         </w:rPr>
         <w:t xml:space="preserve"> </w:t>
       </w:r>
+      <w:commentRangeStart w:id="749"/>
       <w:r>
         <w:t>using</w:t>
+      </w:r>
+      <w:commentRangeEnd w:id="749"/>
+      <w:r>
+        <w:rPr>
+          <w:rStyle w:val="CommentReference"/>
+        </w:rPr>
+        <w:commentReference w:id="749"/>
       </w:r>
       <w:r>
         <w:rPr>
@@ -29512,6 +29194,9 @@
       <w:pPr>
         <w:spacing w:before="185" w:line="259" w:lineRule="auto"/>
         <w:ind w:left="100" w:right="153"/>
+        <w:rPr>
+          <w:ins w:id="750" w:author="Anthony Cossio" w:date="2025-05-15T13:25:00Z"/>
+        </w:rPr>
       </w:pPr>
       <w:r>
         <w:t>Figure 5. Empirical comparisons of acoustic estimates of biomass density from two gliders during the 2023/24</w:t>
@@ -29642,6 +29327,49 @@
       <w:r>
         <w:t>cumulative distribution of biomass for both AMLR03 (blue) and AMLR04 (orange).</w:t>
       </w:r>
+    </w:p>
+    <w:p>
+      <w:pPr>
+        <w:spacing w:before="185" w:line="259" w:lineRule="auto"/>
+        <w:ind w:left="100" w:right="153"/>
+        <w:rPr>
+          <w:ins w:id="751" w:author="Anthony Cossio" w:date="2025-05-15T13:25:00Z"/>
+        </w:rPr>
+      </w:pPr>
+    </w:p>
+    <w:p>
+      <w:pPr>
+        <w:spacing w:before="185" w:line="259" w:lineRule="auto"/>
+        <w:ind w:left="100" w:right="153"/>
+        <w:rPr>
+          <w:ins w:id="752" w:author="Anthony Cossio" w:date="2025-05-15T13:25:00Z"/>
+        </w:rPr>
+      </w:pPr>
+    </w:p>
+    <w:p>
+      <w:pPr>
+        <w:spacing w:before="185" w:line="259" w:lineRule="auto"/>
+        <w:ind w:left="100" w:right="153"/>
+        <w:rPr>
+          <w:ins w:id="753" w:author="Anthony Cossio" w:date="2025-05-15T13:25:00Z"/>
+        </w:rPr>
+      </w:pPr>
+    </w:p>
+    <w:p>
+      <w:pPr>
+        <w:spacing w:before="185" w:line="259" w:lineRule="auto"/>
+        <w:ind w:left="100" w:right="153"/>
+      </w:pPr>
+      <w:ins w:id="754" w:author="Anthony Cossio" w:date="2025-05-15T13:25:00Z">
+        <w:r>
+          <w:t xml:space="preserve">Look at school metrics to see the differences in patches. School </w:t>
+        </w:r>
+      </w:ins>
+      <w:ins w:id="755" w:author="Anthony Cossio" w:date="2025-05-15T13:26:00Z">
+        <w:r>
+          <w:t>size, density, etc. Does it stay within the beam or past it.</w:t>
+        </w:r>
+      </w:ins>
     </w:p>
     <w:sectPr>
       <w:pgSz w:w="12240" w:h="15840"/>
@@ -29670,24 +29398,81 @@
       </w:r>
     </w:p>
   </w:comment>
+  <w:comment w:id="591" w:author="Anthony Cossio" w:date="2025-05-15T13:21:00Z" w:initials="AC">
+    <w:p>
+      <w:pPr>
+        <w:pStyle w:val="CommentText"/>
+      </w:pPr>
+      <w:r>
+        <w:rPr>
+          <w:rStyle w:val="CommentReference"/>
+        </w:rPr>
+        <w:annotationRef/>
+      </w:r>
+      <w:r>
+        <w:t>Do this for just survey area as well.</w:t>
+      </w:r>
+    </w:p>
+  </w:comment>
+  <w:comment w:id="744" w:author="Anthony Cossio" w:date="2025-05-15T13:24:00Z" w:initials="AC">
+    <w:p>
+      <w:pPr>
+        <w:pStyle w:val="CommentText"/>
+      </w:pPr>
+      <w:r>
+        <w:rPr>
+          <w:rStyle w:val="CommentReference"/>
+        </w:rPr>
+        <w:annotationRef/>
+      </w:r>
+      <w:r>
+        <w:t>Get rid of bathymetry</w:t>
+      </w:r>
+    </w:p>
+  </w:comment>
+  <w:comment w:id="749" w:author="Anthony Cossio" w:date="2025-05-15T13:19:00Z" w:initials="AC">
+    <w:p>
+      <w:pPr>
+        <w:pStyle w:val="CommentText"/>
+      </w:pPr>
+      <w:r>
+        <w:rPr>
+          <w:rStyle w:val="CommentReference"/>
+        </w:rPr>
+        <w:annotationRef/>
+      </w:r>
+      <w:r>
+        <w:t>Convert  depth to 500m or log space.</w:t>
+      </w:r>
+    </w:p>
+  </w:comment>
 </w:comments>
 </file>
 
 <file path=word/commentsExtended.xml><?xml version="1.0" encoding="utf-8"?>
 <w15:commentsEx xmlns:wpc="http://schemas.microsoft.com/office/word/2010/wordprocessingCanvas" xmlns:cx="http://schemas.microsoft.com/office/drawing/2014/chartex" xmlns:cx1="http://schemas.microsoft.com/office/drawing/2015/9/8/chartex" xmlns:cx2="http://schemas.microsoft.com/office/drawing/2015/10/21/chartex" xmlns:cx3="http://schemas.microsoft.com/office/drawing/2016/5/9/chartex" xmlns:cx4="http://schemas.microsoft.com/office/drawing/2016/5/10/chartex" xmlns:cx5="http://schemas.microsoft.com/office/drawing/2016/5/11/chartex" xmlns:cx6="http://schemas.microsoft.com/office/drawing/2016/5/12/chartex" xmlns:cx7="http://schemas.microsoft.com/office/drawing/2016/5/13/chartex" xmlns:cx8="http://schemas.microsoft.com/office/drawing/2016/5/14/chartex" xmlns:mc="http://schemas.openxmlformats.org/markup-compatibility/2006" xmlns:aink="http://schemas.microsoft.com/office/drawing/2016/ink" xmlns:am3d="http://schemas.microsoft.com/office/drawing/2017/model3d" xmlns:o="urn:schemas-microsoft-com:office:office" xmlns:r="http://schemas.openxmlformats.org/officeDocument/2006/relationships" xmlns:m="http://schemas.openxmlformats.org/officeDocument/2006/math" xmlns:v="urn:schemas-microsoft-com:vml" xmlns:wp14="http://schemas.microsoft.com/office/word/2010/wordprocessingDrawing" xmlns:wp="http://schemas.openxmlformats.org/drawingml/2006/wordprocessingDrawing" xmlns:w10="urn:schemas-microsoft-com:office:word" xmlns:w="http://schemas.openxmlformats.org/wordprocessingml/2006/main" xmlns:w14="http://schemas.microsoft.com/office/word/2010/wordml" xmlns:w15="http://schemas.microsoft.com/office/word/2012/wordml" xmlns:w16cex="http://schemas.microsoft.com/office/word/2018/wordml/cex" xmlns:w16cid="http://schemas.microsoft.com/office/word/2016/wordml/cid" xmlns:w16="http://schemas.microsoft.com/office/word/2018/wordml" xmlns:w16sdtdh="http://schemas.microsoft.com/office/word/2020/wordml/sdtdatahash" xmlns:w16se="http://schemas.microsoft.com/office/word/2015/wordml/symex" xmlns:wpg="http://schemas.microsoft.com/office/word/2010/wordprocessingGroup" xmlns:wpi="http://schemas.microsoft.com/office/word/2010/wordprocessingInk" xmlns:wne="http://schemas.microsoft.com/office/word/2006/wordml" xmlns:wps="http://schemas.microsoft.com/office/word/2010/wordprocessingShape" mc:Ignorable="w14 w15 w16se w16cid w16 w16cex w16sdtdh wp14">
   <w15:commentEx w15:paraId="7E817B66" w15:done="0"/>
+  <w15:commentEx w15:paraId="21E1AE3B" w15:done="0"/>
+  <w15:commentEx w15:paraId="12D3FBDB" w15:done="0"/>
+  <w15:commentEx w15:paraId="2D25CE88" w15:done="0"/>
 </w15:commentsEx>
 </file>
 
 <file path=word/commentsExtensible.xml><?xml version="1.0" encoding="utf-8"?>
 <w16cex:commentsExtensible xmlns:wpc="http://schemas.microsoft.com/office/word/2010/wordprocessingCanvas" xmlns:cx="http://schemas.microsoft.com/office/drawing/2014/chartex" xmlns:cx1="http://schemas.microsoft.com/office/drawing/2015/9/8/chartex" xmlns:cx2="http://schemas.microsoft.com/office/drawing/2015/10/21/chartex" xmlns:cx3="http://schemas.microsoft.com/office/drawing/2016/5/9/chartex" xmlns:cx4="http://schemas.microsoft.com/office/drawing/2016/5/10/chartex" xmlns:cx5="http://schemas.microsoft.com/office/drawing/2016/5/11/chartex" xmlns:cx6="http://schemas.microsoft.com/office/drawing/2016/5/12/chartex" xmlns:cx7="http://schemas.microsoft.com/office/drawing/2016/5/13/chartex" xmlns:cx8="http://schemas.microsoft.com/office/drawing/2016/5/14/chartex" xmlns:mc="http://schemas.openxmlformats.org/markup-compatibility/2006" xmlns:aink="http://schemas.microsoft.com/office/drawing/2016/ink" xmlns:am3d="http://schemas.microsoft.com/office/drawing/2017/model3d" xmlns:o="urn:schemas-microsoft-com:office:office" xmlns:r="http://schemas.openxmlformats.org/officeDocument/2006/relationships" xmlns:m="http://schemas.openxmlformats.org/officeDocument/2006/math" xmlns:v="urn:schemas-microsoft-com:vml" xmlns:wp14="http://schemas.microsoft.com/office/word/2010/wordprocessingDrawing" xmlns:wp="http://schemas.openxmlformats.org/drawingml/2006/wordprocessingDrawing" xmlns:w10="urn:schemas-microsoft-com:office:word" xmlns:w="http://schemas.openxmlformats.org/wordprocessingml/2006/main" xmlns:w14="http://schemas.microsoft.com/office/word/2010/wordml" xmlns:w15="http://schemas.microsoft.com/office/word/2012/wordml" xmlns:w16cex="http://schemas.microsoft.com/office/word/2018/wordml/cex" xmlns:w16cid="http://schemas.microsoft.com/office/word/2016/wordml/cid" xmlns:w16="http://schemas.microsoft.com/office/word/2018/wordml" xmlns:w16sdtdh="http://schemas.microsoft.com/office/word/2020/wordml/sdtdatahash" xmlns:w16se="http://schemas.microsoft.com/office/word/2015/wordml/symex" xmlns:wpg="http://schemas.microsoft.com/office/word/2010/wordprocessingGroup" xmlns:wpi="http://schemas.microsoft.com/office/word/2010/wordprocessingInk" xmlns:wne="http://schemas.microsoft.com/office/word/2006/wordml" xmlns:wps="http://schemas.microsoft.com/office/word/2010/wordprocessingShape" mc:Ignorable="w14 w15 w16se w16cid w16 w16cex w16sdtdh wp14">
   <w16cex:commentExtensible w16cex:durableId="2BC8A223" w16cex:dateUtc="2025-05-09T22:47:00Z"/>
+  <w16cex:commentExtensible w16cex:durableId="2BD068CE" w16cex:dateUtc="2025-05-15T20:21:00Z"/>
+  <w16cex:commentExtensible w16cex:durableId="2BD06994" w16cex:dateUtc="2025-05-15T20:24:00Z"/>
+  <w16cex:commentExtensible w16cex:durableId="2BD0687E" w16cex:dateUtc="2025-05-15T20:19:00Z"/>
 </w16cex:commentsExtensible>
 </file>
 
 <file path=word/commentsIds.xml><?xml version="1.0" encoding="utf-8"?>
 <w16cid:commentsIds xmlns:wpc="http://schemas.microsoft.com/office/word/2010/wordprocessingCanvas" xmlns:cx="http://schemas.microsoft.com/office/drawing/2014/chartex" xmlns:cx1="http://schemas.microsoft.com/office/drawing/2015/9/8/chartex" xmlns:cx2="http://schemas.microsoft.com/office/drawing/2015/10/21/chartex" xmlns:cx3="http://schemas.microsoft.com/office/drawing/2016/5/9/chartex" xmlns:cx4="http://schemas.microsoft.com/office/drawing/2016/5/10/chartex" xmlns:cx5="http://schemas.microsoft.com/office/drawing/2016/5/11/chartex" xmlns:cx6="http://schemas.microsoft.com/office/drawing/2016/5/12/chartex" xmlns:cx7="http://schemas.microsoft.com/office/drawing/2016/5/13/chartex" xmlns:cx8="http://schemas.microsoft.com/office/drawing/2016/5/14/chartex" xmlns:mc="http://schemas.openxmlformats.org/markup-compatibility/2006" xmlns:aink="http://schemas.microsoft.com/office/drawing/2016/ink" xmlns:am3d="http://schemas.microsoft.com/office/drawing/2017/model3d" xmlns:o="urn:schemas-microsoft-com:office:office" xmlns:r="http://schemas.openxmlformats.org/officeDocument/2006/relationships" xmlns:m="http://schemas.openxmlformats.org/officeDocument/2006/math" xmlns:v="urn:schemas-microsoft-com:vml" xmlns:wp14="http://schemas.microsoft.com/office/word/2010/wordprocessingDrawing" xmlns:wp="http://schemas.openxmlformats.org/drawingml/2006/wordprocessingDrawing" xmlns:w10="urn:schemas-microsoft-com:office:word" xmlns:w="http://schemas.openxmlformats.org/wordprocessingml/2006/main" xmlns:w14="http://schemas.microsoft.com/office/word/2010/wordml" xmlns:w15="http://schemas.microsoft.com/office/word/2012/wordml" xmlns:w16cex="http://schemas.microsoft.com/office/word/2018/wordml/cex" xmlns:w16cid="http://schemas.microsoft.com/office/word/2016/wordml/cid" xmlns:w16="http://schemas.microsoft.com/office/word/2018/wordml" xmlns:w16sdtdh="http://schemas.microsoft.com/office/word/2020/wordml/sdtdatahash" xmlns:w16se="http://schemas.microsoft.com/office/word/2015/wordml/symex" xmlns:wpg="http://schemas.microsoft.com/office/word/2010/wordprocessingGroup" xmlns:wpi="http://schemas.microsoft.com/office/word/2010/wordprocessingInk" xmlns:wne="http://schemas.microsoft.com/office/word/2006/wordml" xmlns:wps="http://schemas.microsoft.com/office/word/2010/wordprocessingShape" mc:Ignorable="w14 w15 w16se w16cid w16 w16cex w16sdtdh wp14">
   <w16cid:commentId w16cid:paraId="7E817B66" w16cid:durableId="2BC8A223"/>
+  <w16cid:commentId w16cid:paraId="21E1AE3B" w16cid:durableId="2BD068CE"/>
+  <w16cid:commentId w16cid:paraId="12D3FBDB" w16cid:durableId="2BD06994"/>
+  <w16cid:commentId w16cid:paraId="2D25CE88" w16cid:durableId="2BD0687E"/>
 </w16cid:commentsIds>
 </file>
 

</xml_diff>